<commit_message>
Add constraints and test cases for orders table
Added foreign key and date check constraints to the orders table in Task2. Updated test insert and update scripts to include cases for constraint violations. Also added an update for authors without address in Task3.
</commit_message>
<xml_diff>
--- a/DataBase/Task1/03_ПМИ_23_о_ИП_3_ТумановДМ_ЛР1_20-11-2025.docx
+++ b/DataBase/Task1/03_ПМИ_23_о_ИП_3_ТумановДМ_ЛР1_20-11-2025.docx
@@ -4,42 +4,29 @@
   <w:body>
     <w:p>
       <w:r>
-        <w:t xml:space="preserve">В </w:t>
-      </w:r>
-      <w:r>
-        <w:t>рамках лабораторной работы необходимо</w:t>
-      </w:r>
-      <w:r>
-        <w:t xml:space="preserve"> было</w:t>
-      </w:r>
-      <w:r>
-        <w:t xml:space="preserve"> разработать логическую модель базы данных для издательства. По условию издательство работает с заказчиками, принимает и выполняет заказы, ведёт учёт изданий и сотрудничает с авторами. </w:t>
+        <w:t>В рамках лабораторной работы была разработана логическая модель базы данных, предназначенная для автоматизации деятельности издательства. Модель охватывает основные процессы работы: взаимодействие с заказчиками, оформление заказов, учёт изданий, хранение сведений об авторах и сотрудничество с типографиями. В базе фиксируются данные о заказчиках двух типов — физических лицах и организациях, включая их наименование, контактную информацию, адрес, телефон, факс и, при необходимости, контактное лицо.</w:t>
       </w:r>
     </w:p>
     <w:p>
       <w:r>
-        <w:t>В издательство могут обращаться как частные лица, так и организации. Для каждого заказчика необходимо хранить контактные данные: название или ФИО, адрес, телефон, факс и данные контактной персоны. Далее, издательство принимает заказы на печатную продукцию. Каждый заказ связан с конкретным заказчиком и содержит информацию о виде продукции, связанном издании, данных типографии (её название, адрес, телефон), а также даты приёма и выполнения заказа и отметку о его выполнении.</w:t>
+        <w:t>Учёт издательской продукции реализован через сущность «Издания», для которой сохраняются название, объём в печатных листах и тираж. Поскольку одно издание может иметь нескольких авторов, а один автор может участвовать в создании разных изданий, предусмотрена отдельная сущность «Авторы» с персональными данными, а связь между авторами и изданиями оформлена через промежуточную таблицу. Для выполнения печати издательство взаимодействует с типографиями, по каждой из которых хранятся название, адрес и телефон.</w:t>
       </w:r>
     </w:p>
     <w:p>
       <w:r>
-        <w:t xml:space="preserve">Отдельно учитываются сведения об изданиях, которые издательство выпускает. Для каждого издания фиксируются код, название, авторский состав, объём в печатных листах и тираж. </w:t>
-      </w:r>
-      <w:r>
-        <w:t xml:space="preserve">Т. к. </w:t>
-      </w:r>
-      <w:r>
-        <w:t>издания могут создаваться несколькими авторами, а один автор может участвовать в работе над разными проектами, вводится сущность "Автор". Для автора указываются Ф.И.О., домашний адрес, телефон и дополнительные сведения.</w:t>
+        <w:t>Центральной частью модели является сущность «Заказы». Каждый заказ связан с конкретным заказчиком, с указанным типом продукции, изданием и выбранной типографией. В заказе фиксируются даты приёма и завершения, а также отметка о его выполнении, при этом введены ограничения для обеспечения корректности данных, включая проверку допустимости дат.</w:t>
       </w:r>
     </w:p>
-    <w:p/>
     <w:p>
       <w:r>
+        <w:rPr>
+          <w:noProof/>
+        </w:rPr>
         <w:drawing>
-          <wp:inline distT="0" distB="0" distL="0" distR="0" wp14:anchorId="1D799FCF" wp14:editId="21721843">
-            <wp:extent cx="5940425" cy="3803650"/>
-            <wp:effectExtent l="0" t="0" r="3175" b="6350"/>
-            <wp:docPr id="1138118883" name="Рисунок 1"/>
+          <wp:inline distT="0" distB="0" distL="0" distR="0" wp14:anchorId="4005D7FF" wp14:editId="39401E19">
+            <wp:extent cx="5940425" cy="4798060"/>
+            <wp:effectExtent l="0" t="0" r="3175" b="2540"/>
+            <wp:docPr id="209249099" name="Рисунок 1" descr="Изображение выглядит как текст, снимок экрана, программное обеспечение, дизайн&#10;&#10;Содержимое, созданное искусственным интеллектом, может быть неверным."/>
             <wp:cNvGraphicFramePr>
               <a:graphicFrameLocks xmlns:a="http://schemas.openxmlformats.org/drawingml/2006/main" noChangeAspect="1"/>
             </wp:cNvGraphicFramePr>
@@ -47,7 +34,7 @@
               <a:graphicData uri="http://schemas.openxmlformats.org/drawingml/2006/picture">
                 <pic:pic xmlns:pic="http://schemas.openxmlformats.org/drawingml/2006/picture">
                   <pic:nvPicPr>
-                    <pic:cNvPr id="1138118883" name=""/>
+                    <pic:cNvPr id="209249099" name="Рисунок 1" descr="Изображение выглядит как текст, снимок экрана, программное обеспечение, дизайн&#10;&#10;Содержимое, созданное искусственным интеллектом, может быть неверным."/>
                     <pic:cNvPicPr/>
                   </pic:nvPicPr>
                   <pic:blipFill>
@@ -59,7 +46,7 @@
                   <pic:spPr>
                     <a:xfrm>
                       <a:off x="0" y="0"/>
-                      <a:ext cx="5940425" cy="3803650"/>
+                      <a:ext cx="5940425" cy="4798060"/>
                     </a:xfrm>
                     <a:prstGeom prst="rect">
                       <a:avLst/>
@@ -71,6 +58,2334 @@
           </wp:inline>
         </w:drawing>
       </w:r>
+    </w:p>
+    <w:p>
+      <w:r>
+        <w:lastRenderedPageBreak/>
+        <w:t>И скрипт миграции из исходной:</w:t>
+      </w:r>
+    </w:p>
+    <w:p>
+      <w:pPr>
+        <w:shd w:val="clear" w:color="auto" w:fill="1E1F22"/>
+        <w:tabs>
+          <w:tab w:val="left" w:pos="916"/>
+          <w:tab w:val="left" w:pos="1832"/>
+          <w:tab w:val="left" w:pos="2748"/>
+          <w:tab w:val="left" w:pos="3664"/>
+          <w:tab w:val="left" w:pos="4580"/>
+          <w:tab w:val="left" w:pos="5496"/>
+          <w:tab w:val="left" w:pos="6412"/>
+          <w:tab w:val="left" w:pos="7328"/>
+          <w:tab w:val="left" w:pos="8244"/>
+          <w:tab w:val="left" w:pos="9160"/>
+          <w:tab w:val="left" w:pos="10076"/>
+          <w:tab w:val="left" w:pos="10992"/>
+          <w:tab w:val="left" w:pos="11908"/>
+          <w:tab w:val="left" w:pos="12824"/>
+          <w:tab w:val="left" w:pos="13740"/>
+          <w:tab w:val="left" w:pos="14656"/>
+        </w:tabs>
+        <w:spacing w:after="0" w:line="240" w:lineRule="auto"/>
+        <w:rPr>
+          <w:rFonts w:ascii="Courier New" w:eastAsia="Times New Roman" w:hAnsi="Courier New" w:cs="Courier New"/>
+          <w:color w:val="BCBEC4"/>
+          <w:kern w:val="0"/>
+          <w:sz w:val="20"/>
+          <w:szCs w:val="20"/>
+          <w:lang w:val="en-US" w:eastAsia="ru-RU"/>
+          <w14:ligatures w14:val="none"/>
+        </w:rPr>
+      </w:pPr>
+      <w:r>
+        <w:rPr>
+          <w:rFonts w:ascii="Courier New" w:eastAsia="Times New Roman" w:hAnsi="Courier New" w:cs="Courier New"/>
+          <w:color w:val="CF8E6D"/>
+          <w:kern w:val="0"/>
+          <w:sz w:val="20"/>
+          <w:szCs w:val="20"/>
+          <w:lang w:val="en-US" w:eastAsia="ru-RU"/>
+          <w14:ligatures w14:val="none"/>
+        </w:rPr>
+        <w:t>BEGIN</w:t>
+      </w:r>
+      <w:r>
+        <w:rPr>
+          <w:rFonts w:ascii="Courier New" w:eastAsia="Times New Roman" w:hAnsi="Courier New" w:cs="Courier New"/>
+          <w:color w:val="BCBEC4"/>
+          <w:kern w:val="0"/>
+          <w:sz w:val="20"/>
+          <w:szCs w:val="20"/>
+          <w:lang w:val="en-US" w:eastAsia="ru-RU"/>
+          <w14:ligatures w14:val="none"/>
+        </w:rPr>
+        <w:t>;</w:t>
+      </w:r>
+      <w:r>
+        <w:rPr>
+          <w:rFonts w:ascii="Courier New" w:eastAsia="Times New Roman" w:hAnsi="Courier New" w:cs="Courier New"/>
+          <w:color w:val="BCBEC4"/>
+          <w:kern w:val="0"/>
+          <w:sz w:val="20"/>
+          <w:szCs w:val="20"/>
+          <w:lang w:val="en-US" w:eastAsia="ru-RU"/>
+          <w14:ligatures w14:val="none"/>
+        </w:rPr>
+        <w:br/>
+      </w:r>
+      <w:r>
+        <w:rPr>
+          <w:rFonts w:ascii="Courier New" w:eastAsia="Times New Roman" w:hAnsi="Courier New" w:cs="Courier New"/>
+          <w:color w:val="BCBEC4"/>
+          <w:kern w:val="0"/>
+          <w:sz w:val="20"/>
+          <w:szCs w:val="20"/>
+          <w:lang w:val="en-US" w:eastAsia="ru-RU"/>
+          <w14:ligatures w14:val="none"/>
+        </w:rPr>
+        <w:br/>
+      </w:r>
+      <w:r>
+        <w:rPr>
+          <w:rFonts w:ascii="Courier New" w:eastAsia="Times New Roman" w:hAnsi="Courier New" w:cs="Courier New"/>
+          <w:color w:val="7A7E85"/>
+          <w:kern w:val="0"/>
+          <w:sz w:val="20"/>
+          <w:szCs w:val="20"/>
+          <w:lang w:val="en-US" w:eastAsia="ru-RU"/>
+          <w14:ligatures w14:val="none"/>
+        </w:rPr>
+        <w:t>-- 1. Create table to store unique typography details</w:t>
+      </w:r>
+      <w:r>
+        <w:rPr>
+          <w:rFonts w:ascii="Courier New" w:eastAsia="Times New Roman" w:hAnsi="Courier New" w:cs="Courier New"/>
+          <w:color w:val="7A7E85"/>
+          <w:kern w:val="0"/>
+          <w:sz w:val="20"/>
+          <w:szCs w:val="20"/>
+          <w:lang w:val="en-US" w:eastAsia="ru-RU"/>
+          <w14:ligatures w14:val="none"/>
+        </w:rPr>
+        <w:br/>
+      </w:r>
+      <w:r>
+        <w:rPr>
+          <w:rFonts w:ascii="Courier New" w:eastAsia="Times New Roman" w:hAnsi="Courier New" w:cs="Courier New"/>
+          <w:color w:val="CF8E6D"/>
+          <w:kern w:val="0"/>
+          <w:sz w:val="20"/>
+          <w:szCs w:val="20"/>
+          <w:lang w:val="en-US" w:eastAsia="ru-RU"/>
+          <w14:ligatures w14:val="none"/>
+        </w:rPr>
+        <w:t xml:space="preserve">CREATE TABLE IF NOT EXISTS </w:t>
+      </w:r>
+      <w:r>
+        <w:rPr>
+          <w:rFonts w:ascii="Courier New" w:eastAsia="Times New Roman" w:hAnsi="Courier New" w:cs="Courier New"/>
+          <w:color w:val="BCBEC4"/>
+          <w:kern w:val="0"/>
+          <w:sz w:val="20"/>
+          <w:szCs w:val="20"/>
+          <w:lang w:val="en-US" w:eastAsia="ru-RU"/>
+          <w14:ligatures w14:val="none"/>
+        </w:rPr>
+        <w:t>typographies (</w:t>
+      </w:r>
+      <w:r>
+        <w:rPr>
+          <w:rFonts w:ascii="Courier New" w:eastAsia="Times New Roman" w:hAnsi="Courier New" w:cs="Courier New"/>
+          <w:color w:val="BCBEC4"/>
+          <w:kern w:val="0"/>
+          <w:sz w:val="20"/>
+          <w:szCs w:val="20"/>
+          <w:lang w:val="en-US" w:eastAsia="ru-RU"/>
+          <w14:ligatures w14:val="none"/>
+        </w:rPr>
+        <w:br/>
+        <w:t xml:space="preserve">  </w:t>
+      </w:r>
+      <w:r>
+        <w:rPr>
+          <w:rFonts w:ascii="Courier New" w:eastAsia="Times New Roman" w:hAnsi="Courier New" w:cs="Courier New"/>
+          <w:color w:val="C77DBB"/>
+          <w:kern w:val="0"/>
+          <w:sz w:val="20"/>
+          <w:szCs w:val="20"/>
+          <w:lang w:val="en-US" w:eastAsia="ru-RU"/>
+          <w14:ligatures w14:val="none"/>
+        </w:rPr>
+        <w:t xml:space="preserve">id </w:t>
+      </w:r>
+      <w:r>
+        <w:rPr>
+          <w:rFonts w:ascii="Courier New" w:eastAsia="Times New Roman" w:hAnsi="Courier New" w:cs="Courier New"/>
+          <w:color w:val="CF8E6D"/>
+          <w:kern w:val="0"/>
+          <w:sz w:val="20"/>
+          <w:szCs w:val="20"/>
+          <w:lang w:val="en-US" w:eastAsia="ru-RU"/>
+          <w14:ligatures w14:val="none"/>
+        </w:rPr>
+        <w:t>serial PRIMARY KEY</w:t>
+      </w:r>
+      <w:r>
+        <w:rPr>
+          <w:rFonts w:ascii="Courier New" w:eastAsia="Times New Roman" w:hAnsi="Courier New" w:cs="Courier New"/>
+          <w:color w:val="BCBEC4"/>
+          <w:kern w:val="0"/>
+          <w:sz w:val="20"/>
+          <w:szCs w:val="20"/>
+          <w:lang w:val="en-US" w:eastAsia="ru-RU"/>
+          <w14:ligatures w14:val="none"/>
+        </w:rPr>
+        <w:t>,</w:t>
+      </w:r>
+      <w:r>
+        <w:rPr>
+          <w:rFonts w:ascii="Courier New" w:eastAsia="Times New Roman" w:hAnsi="Courier New" w:cs="Courier New"/>
+          <w:color w:val="BCBEC4"/>
+          <w:kern w:val="0"/>
+          <w:sz w:val="20"/>
+          <w:szCs w:val="20"/>
+          <w:lang w:val="en-US" w:eastAsia="ru-RU"/>
+          <w14:ligatures w14:val="none"/>
+        </w:rPr>
+        <w:br/>
+        <w:t xml:space="preserve">  </w:t>
+      </w:r>
+      <w:r>
+        <w:rPr>
+          <w:rFonts w:ascii="Courier New" w:eastAsia="Times New Roman" w:hAnsi="Courier New" w:cs="Courier New"/>
+          <w:color w:val="C77DBB"/>
+          <w:kern w:val="0"/>
+          <w:sz w:val="20"/>
+          <w:szCs w:val="20"/>
+          <w:lang w:val="en-US" w:eastAsia="ru-RU"/>
+          <w14:ligatures w14:val="none"/>
+        </w:rPr>
+        <w:t xml:space="preserve">name </w:t>
+      </w:r>
+      <w:r>
+        <w:rPr>
+          <w:rFonts w:ascii="Courier New" w:eastAsia="Times New Roman" w:hAnsi="Courier New" w:cs="Courier New"/>
+          <w:color w:val="CF8E6D"/>
+          <w:kern w:val="0"/>
+          <w:sz w:val="20"/>
+          <w:szCs w:val="20"/>
+          <w:lang w:val="en-US" w:eastAsia="ru-RU"/>
+          <w14:ligatures w14:val="none"/>
+        </w:rPr>
+        <w:t>text NOT NULL</w:t>
+      </w:r>
+      <w:r>
+        <w:rPr>
+          <w:rFonts w:ascii="Courier New" w:eastAsia="Times New Roman" w:hAnsi="Courier New" w:cs="Courier New"/>
+          <w:color w:val="BCBEC4"/>
+          <w:kern w:val="0"/>
+          <w:sz w:val="20"/>
+          <w:szCs w:val="20"/>
+          <w:lang w:val="en-US" w:eastAsia="ru-RU"/>
+          <w14:ligatures w14:val="none"/>
+        </w:rPr>
+        <w:t>,</w:t>
+      </w:r>
+      <w:r>
+        <w:rPr>
+          <w:rFonts w:ascii="Courier New" w:eastAsia="Times New Roman" w:hAnsi="Courier New" w:cs="Courier New"/>
+          <w:color w:val="BCBEC4"/>
+          <w:kern w:val="0"/>
+          <w:sz w:val="20"/>
+          <w:szCs w:val="20"/>
+          <w:lang w:val="en-US" w:eastAsia="ru-RU"/>
+          <w14:ligatures w14:val="none"/>
+        </w:rPr>
+        <w:br/>
+        <w:t xml:space="preserve">  </w:t>
+      </w:r>
+      <w:r>
+        <w:rPr>
+          <w:rFonts w:ascii="Courier New" w:eastAsia="Times New Roman" w:hAnsi="Courier New" w:cs="Courier New"/>
+          <w:color w:val="C77DBB"/>
+          <w:kern w:val="0"/>
+          <w:sz w:val="20"/>
+          <w:szCs w:val="20"/>
+          <w:lang w:val="en-US" w:eastAsia="ru-RU"/>
+          <w14:ligatures w14:val="none"/>
+        </w:rPr>
+        <w:t xml:space="preserve">addr </w:t>
+      </w:r>
+      <w:r>
+        <w:rPr>
+          <w:rFonts w:ascii="Courier New" w:eastAsia="Times New Roman" w:hAnsi="Courier New" w:cs="Courier New"/>
+          <w:color w:val="CF8E6D"/>
+          <w:kern w:val="0"/>
+          <w:sz w:val="20"/>
+          <w:szCs w:val="20"/>
+          <w:lang w:val="en-US" w:eastAsia="ru-RU"/>
+          <w14:ligatures w14:val="none"/>
+        </w:rPr>
+        <w:t>text</w:t>
+      </w:r>
+      <w:r>
+        <w:rPr>
+          <w:rFonts w:ascii="Courier New" w:eastAsia="Times New Roman" w:hAnsi="Courier New" w:cs="Courier New"/>
+          <w:color w:val="BCBEC4"/>
+          <w:kern w:val="0"/>
+          <w:sz w:val="20"/>
+          <w:szCs w:val="20"/>
+          <w:lang w:val="en-US" w:eastAsia="ru-RU"/>
+          <w14:ligatures w14:val="none"/>
+        </w:rPr>
+        <w:t>,</w:t>
+      </w:r>
+      <w:r>
+        <w:rPr>
+          <w:rFonts w:ascii="Courier New" w:eastAsia="Times New Roman" w:hAnsi="Courier New" w:cs="Courier New"/>
+          <w:color w:val="BCBEC4"/>
+          <w:kern w:val="0"/>
+          <w:sz w:val="20"/>
+          <w:szCs w:val="20"/>
+          <w:lang w:val="en-US" w:eastAsia="ru-RU"/>
+          <w14:ligatures w14:val="none"/>
+        </w:rPr>
+        <w:br/>
+        <w:t xml:space="preserve">  </w:t>
+      </w:r>
+      <w:r>
+        <w:rPr>
+          <w:rFonts w:ascii="Courier New" w:eastAsia="Times New Roman" w:hAnsi="Courier New" w:cs="Courier New"/>
+          <w:color w:val="C77DBB"/>
+          <w:kern w:val="0"/>
+          <w:sz w:val="20"/>
+          <w:szCs w:val="20"/>
+          <w:lang w:val="en-US" w:eastAsia="ru-RU"/>
+          <w14:ligatures w14:val="none"/>
+        </w:rPr>
+        <w:t xml:space="preserve">tel </w:t>
+      </w:r>
+      <w:r>
+        <w:rPr>
+          <w:rFonts w:ascii="Courier New" w:eastAsia="Times New Roman" w:hAnsi="Courier New" w:cs="Courier New"/>
+          <w:color w:val="CF8E6D"/>
+          <w:kern w:val="0"/>
+          <w:sz w:val="20"/>
+          <w:szCs w:val="20"/>
+          <w:lang w:val="en-US" w:eastAsia="ru-RU"/>
+          <w14:ligatures w14:val="none"/>
+        </w:rPr>
+        <w:t>text</w:t>
+      </w:r>
+      <w:r>
+        <w:rPr>
+          <w:rFonts w:ascii="Courier New" w:eastAsia="Times New Roman" w:hAnsi="Courier New" w:cs="Courier New"/>
+          <w:color w:val="BCBEC4"/>
+          <w:kern w:val="0"/>
+          <w:sz w:val="20"/>
+          <w:szCs w:val="20"/>
+          <w:lang w:val="en-US" w:eastAsia="ru-RU"/>
+          <w14:ligatures w14:val="none"/>
+        </w:rPr>
+        <w:t>,</w:t>
+      </w:r>
+      <w:r>
+        <w:rPr>
+          <w:rFonts w:ascii="Courier New" w:eastAsia="Times New Roman" w:hAnsi="Courier New" w:cs="Courier New"/>
+          <w:color w:val="BCBEC4"/>
+          <w:kern w:val="0"/>
+          <w:sz w:val="20"/>
+          <w:szCs w:val="20"/>
+          <w:lang w:val="en-US" w:eastAsia="ru-RU"/>
+          <w14:ligatures w14:val="none"/>
+        </w:rPr>
+        <w:br/>
+        <w:t xml:space="preserve">  </w:t>
+      </w:r>
+      <w:r>
+        <w:rPr>
+          <w:rFonts w:ascii="Courier New" w:eastAsia="Times New Roman" w:hAnsi="Courier New" w:cs="Courier New"/>
+          <w:color w:val="CF8E6D"/>
+          <w:kern w:val="0"/>
+          <w:sz w:val="20"/>
+          <w:szCs w:val="20"/>
+          <w:lang w:val="en-US" w:eastAsia="ru-RU"/>
+          <w14:ligatures w14:val="none"/>
+        </w:rPr>
+        <w:t xml:space="preserve">CONSTRAINT </w:t>
+      </w:r>
+      <w:r>
+        <w:rPr>
+          <w:rFonts w:ascii="Courier New" w:eastAsia="Times New Roman" w:hAnsi="Courier New" w:cs="Courier New"/>
+          <w:color w:val="BCBEC4"/>
+          <w:kern w:val="0"/>
+          <w:sz w:val="20"/>
+          <w:szCs w:val="20"/>
+          <w:lang w:val="en-US" w:eastAsia="ru-RU"/>
+          <w14:ligatures w14:val="none"/>
+        </w:rPr>
+        <w:t xml:space="preserve">uq_typography </w:t>
+      </w:r>
+      <w:r>
+        <w:rPr>
+          <w:rFonts w:ascii="Courier New" w:eastAsia="Times New Roman" w:hAnsi="Courier New" w:cs="Courier New"/>
+          <w:color w:val="CF8E6D"/>
+          <w:kern w:val="0"/>
+          <w:sz w:val="20"/>
+          <w:szCs w:val="20"/>
+          <w:lang w:val="en-US" w:eastAsia="ru-RU"/>
+          <w14:ligatures w14:val="none"/>
+        </w:rPr>
+        <w:t>UNIQUE</w:t>
+      </w:r>
+      <w:r>
+        <w:rPr>
+          <w:rFonts w:ascii="Courier New" w:eastAsia="Times New Roman" w:hAnsi="Courier New" w:cs="Courier New"/>
+          <w:color w:val="BCBEC4"/>
+          <w:kern w:val="0"/>
+          <w:sz w:val="20"/>
+          <w:szCs w:val="20"/>
+          <w:lang w:val="en-US" w:eastAsia="ru-RU"/>
+          <w14:ligatures w14:val="none"/>
+        </w:rPr>
+        <w:t>(</w:t>
+      </w:r>
+      <w:r>
+        <w:rPr>
+          <w:rFonts w:ascii="Courier New" w:eastAsia="Times New Roman" w:hAnsi="Courier New" w:cs="Courier New"/>
+          <w:color w:val="C77DBB"/>
+          <w:kern w:val="0"/>
+          <w:sz w:val="20"/>
+          <w:szCs w:val="20"/>
+          <w:lang w:val="en-US" w:eastAsia="ru-RU"/>
+          <w14:ligatures w14:val="none"/>
+        </w:rPr>
+        <w:t>name</w:t>
+      </w:r>
+      <w:r>
+        <w:rPr>
+          <w:rFonts w:ascii="Courier New" w:eastAsia="Times New Roman" w:hAnsi="Courier New" w:cs="Courier New"/>
+          <w:color w:val="BCBEC4"/>
+          <w:kern w:val="0"/>
+          <w:sz w:val="20"/>
+          <w:szCs w:val="20"/>
+          <w:lang w:val="en-US" w:eastAsia="ru-RU"/>
+          <w14:ligatures w14:val="none"/>
+        </w:rPr>
+        <w:t xml:space="preserve">, </w:t>
+      </w:r>
+      <w:r>
+        <w:rPr>
+          <w:rFonts w:ascii="Courier New" w:eastAsia="Times New Roman" w:hAnsi="Courier New" w:cs="Courier New"/>
+          <w:color w:val="C77DBB"/>
+          <w:kern w:val="0"/>
+          <w:sz w:val="20"/>
+          <w:szCs w:val="20"/>
+          <w:lang w:val="en-US" w:eastAsia="ru-RU"/>
+          <w14:ligatures w14:val="none"/>
+        </w:rPr>
+        <w:t>addr</w:t>
+      </w:r>
+      <w:r>
+        <w:rPr>
+          <w:rFonts w:ascii="Courier New" w:eastAsia="Times New Roman" w:hAnsi="Courier New" w:cs="Courier New"/>
+          <w:color w:val="BCBEC4"/>
+          <w:kern w:val="0"/>
+          <w:sz w:val="20"/>
+          <w:szCs w:val="20"/>
+          <w:lang w:val="en-US" w:eastAsia="ru-RU"/>
+          <w14:ligatures w14:val="none"/>
+        </w:rPr>
+        <w:t xml:space="preserve">, </w:t>
+      </w:r>
+      <w:r>
+        <w:rPr>
+          <w:rFonts w:ascii="Courier New" w:eastAsia="Times New Roman" w:hAnsi="Courier New" w:cs="Courier New"/>
+          <w:color w:val="C77DBB"/>
+          <w:kern w:val="0"/>
+          <w:sz w:val="20"/>
+          <w:szCs w:val="20"/>
+          <w:lang w:val="en-US" w:eastAsia="ru-RU"/>
+          <w14:ligatures w14:val="none"/>
+        </w:rPr>
+        <w:t>tel</w:t>
+      </w:r>
+      <w:r>
+        <w:rPr>
+          <w:rFonts w:ascii="Courier New" w:eastAsia="Times New Roman" w:hAnsi="Courier New" w:cs="Courier New"/>
+          <w:color w:val="BCBEC4"/>
+          <w:kern w:val="0"/>
+          <w:sz w:val="20"/>
+          <w:szCs w:val="20"/>
+          <w:lang w:val="en-US" w:eastAsia="ru-RU"/>
+          <w14:ligatures w14:val="none"/>
+        </w:rPr>
+        <w:t>)</w:t>
+      </w:r>
+      <w:r>
+        <w:rPr>
+          <w:rFonts w:ascii="Courier New" w:eastAsia="Times New Roman" w:hAnsi="Courier New" w:cs="Courier New"/>
+          <w:color w:val="BCBEC4"/>
+          <w:kern w:val="0"/>
+          <w:sz w:val="20"/>
+          <w:szCs w:val="20"/>
+          <w:lang w:val="en-US" w:eastAsia="ru-RU"/>
+          <w14:ligatures w14:val="none"/>
+        </w:rPr>
+        <w:br/>
+        <w:t>);</w:t>
+      </w:r>
+      <w:r>
+        <w:rPr>
+          <w:rFonts w:ascii="Courier New" w:eastAsia="Times New Roman" w:hAnsi="Courier New" w:cs="Courier New"/>
+          <w:color w:val="BCBEC4"/>
+          <w:kern w:val="0"/>
+          <w:sz w:val="20"/>
+          <w:szCs w:val="20"/>
+          <w:lang w:val="en-US" w:eastAsia="ru-RU"/>
+          <w14:ligatures w14:val="none"/>
+        </w:rPr>
+        <w:br/>
+      </w:r>
+      <w:r>
+        <w:rPr>
+          <w:rFonts w:ascii="Courier New" w:eastAsia="Times New Roman" w:hAnsi="Courier New" w:cs="Courier New"/>
+          <w:color w:val="BCBEC4"/>
+          <w:kern w:val="0"/>
+          <w:sz w:val="20"/>
+          <w:szCs w:val="20"/>
+          <w:lang w:val="en-US" w:eastAsia="ru-RU"/>
+          <w14:ligatures w14:val="none"/>
+        </w:rPr>
+        <w:br/>
+      </w:r>
+      <w:r>
+        <w:rPr>
+          <w:rFonts w:ascii="Courier New" w:eastAsia="Times New Roman" w:hAnsi="Courier New" w:cs="Courier New"/>
+          <w:color w:val="7A7E85"/>
+          <w:kern w:val="0"/>
+          <w:sz w:val="20"/>
+          <w:szCs w:val="20"/>
+          <w:lang w:val="en-US" w:eastAsia="ru-RU"/>
+          <w14:ligatures w14:val="none"/>
+        </w:rPr>
+        <w:t>-- 2. Add reference column to orders</w:t>
+      </w:r>
+      <w:r>
+        <w:rPr>
+          <w:rFonts w:ascii="Courier New" w:eastAsia="Times New Roman" w:hAnsi="Courier New" w:cs="Courier New"/>
+          <w:color w:val="7A7E85"/>
+          <w:kern w:val="0"/>
+          <w:sz w:val="20"/>
+          <w:szCs w:val="20"/>
+          <w:lang w:val="en-US" w:eastAsia="ru-RU"/>
+          <w14:ligatures w14:val="none"/>
+        </w:rPr>
+        <w:br/>
+      </w:r>
+      <w:r>
+        <w:rPr>
+          <w:rFonts w:ascii="Courier New" w:eastAsia="Times New Roman" w:hAnsi="Courier New" w:cs="Courier New"/>
+          <w:color w:val="CF8E6D"/>
+          <w:kern w:val="0"/>
+          <w:sz w:val="20"/>
+          <w:szCs w:val="20"/>
+          <w:lang w:val="en-US" w:eastAsia="ru-RU"/>
+          <w14:ligatures w14:val="none"/>
+        </w:rPr>
+        <w:t xml:space="preserve">ALTER TABLE </w:t>
+      </w:r>
+      <w:r>
+        <w:rPr>
+          <w:rFonts w:ascii="Courier New" w:eastAsia="Times New Roman" w:hAnsi="Courier New" w:cs="Courier New"/>
+          <w:color w:val="BCBEC4"/>
+          <w:kern w:val="0"/>
+          <w:sz w:val="20"/>
+          <w:szCs w:val="20"/>
+          <w:lang w:val="en-US" w:eastAsia="ru-RU"/>
+          <w14:ligatures w14:val="none"/>
+        </w:rPr>
+        <w:t>orders</w:t>
+      </w:r>
+      <w:r>
+        <w:rPr>
+          <w:rFonts w:ascii="Courier New" w:eastAsia="Times New Roman" w:hAnsi="Courier New" w:cs="Courier New"/>
+          <w:color w:val="BCBEC4"/>
+          <w:kern w:val="0"/>
+          <w:sz w:val="20"/>
+          <w:szCs w:val="20"/>
+          <w:lang w:val="en-US" w:eastAsia="ru-RU"/>
+          <w14:ligatures w14:val="none"/>
+        </w:rPr>
+        <w:br/>
+        <w:t xml:space="preserve">  </w:t>
+      </w:r>
+      <w:r>
+        <w:rPr>
+          <w:rFonts w:ascii="Courier New" w:eastAsia="Times New Roman" w:hAnsi="Courier New" w:cs="Courier New"/>
+          <w:color w:val="CF8E6D"/>
+          <w:kern w:val="0"/>
+          <w:sz w:val="20"/>
+          <w:szCs w:val="20"/>
+          <w:lang w:val="en-US" w:eastAsia="ru-RU"/>
+          <w14:ligatures w14:val="none"/>
+        </w:rPr>
+        <w:t xml:space="preserve">ADD COLUMN IF NOT EXISTS </w:t>
+      </w:r>
+      <w:r>
+        <w:rPr>
+          <w:rFonts w:ascii="Courier New" w:eastAsia="Times New Roman" w:hAnsi="Courier New" w:cs="Courier New"/>
+          <w:color w:val="C77DBB"/>
+          <w:kern w:val="0"/>
+          <w:sz w:val="20"/>
+          <w:szCs w:val="20"/>
+          <w:lang w:val="en-US" w:eastAsia="ru-RU"/>
+          <w14:ligatures w14:val="none"/>
+        </w:rPr>
+        <w:t xml:space="preserve">typography_id </w:t>
+      </w:r>
+      <w:r>
+        <w:rPr>
+          <w:rFonts w:ascii="Courier New" w:eastAsia="Times New Roman" w:hAnsi="Courier New" w:cs="Courier New"/>
+          <w:color w:val="CF8E6D"/>
+          <w:kern w:val="0"/>
+          <w:sz w:val="20"/>
+          <w:szCs w:val="20"/>
+          <w:lang w:val="en-US" w:eastAsia="ru-RU"/>
+          <w14:ligatures w14:val="none"/>
+        </w:rPr>
+        <w:t>int</w:t>
+      </w:r>
+      <w:r>
+        <w:rPr>
+          <w:rFonts w:ascii="Courier New" w:eastAsia="Times New Roman" w:hAnsi="Courier New" w:cs="Courier New"/>
+          <w:color w:val="BCBEC4"/>
+          <w:kern w:val="0"/>
+          <w:sz w:val="20"/>
+          <w:szCs w:val="20"/>
+          <w:lang w:val="en-US" w:eastAsia="ru-RU"/>
+          <w14:ligatures w14:val="none"/>
+        </w:rPr>
+        <w:t>;</w:t>
+      </w:r>
+      <w:r>
+        <w:rPr>
+          <w:rFonts w:ascii="Courier New" w:eastAsia="Times New Roman" w:hAnsi="Courier New" w:cs="Courier New"/>
+          <w:color w:val="BCBEC4"/>
+          <w:kern w:val="0"/>
+          <w:sz w:val="20"/>
+          <w:szCs w:val="20"/>
+          <w:lang w:val="en-US" w:eastAsia="ru-RU"/>
+          <w14:ligatures w14:val="none"/>
+        </w:rPr>
+        <w:br/>
+      </w:r>
+      <w:r>
+        <w:rPr>
+          <w:rFonts w:ascii="Courier New" w:eastAsia="Times New Roman" w:hAnsi="Courier New" w:cs="Courier New"/>
+          <w:color w:val="BCBEC4"/>
+          <w:kern w:val="0"/>
+          <w:sz w:val="20"/>
+          <w:szCs w:val="20"/>
+          <w:lang w:val="en-US" w:eastAsia="ru-RU"/>
+          <w14:ligatures w14:val="none"/>
+        </w:rPr>
+        <w:br/>
+      </w:r>
+      <w:r>
+        <w:rPr>
+          <w:rFonts w:ascii="Courier New" w:eastAsia="Times New Roman" w:hAnsi="Courier New" w:cs="Courier New"/>
+          <w:color w:val="7A7E85"/>
+          <w:kern w:val="0"/>
+          <w:sz w:val="20"/>
+          <w:szCs w:val="20"/>
+          <w:lang w:val="en-US" w:eastAsia="ru-RU"/>
+          <w14:ligatures w14:val="none"/>
+        </w:rPr>
+        <w:t>-- 3. Seed typographies from existing orders data</w:t>
+      </w:r>
+      <w:r>
+        <w:rPr>
+          <w:rFonts w:ascii="Courier New" w:eastAsia="Times New Roman" w:hAnsi="Courier New" w:cs="Courier New"/>
+          <w:color w:val="7A7E85"/>
+          <w:kern w:val="0"/>
+          <w:sz w:val="20"/>
+          <w:szCs w:val="20"/>
+          <w:lang w:val="en-US" w:eastAsia="ru-RU"/>
+          <w14:ligatures w14:val="none"/>
+        </w:rPr>
+        <w:br/>
+      </w:r>
+      <w:r>
+        <w:rPr>
+          <w:rFonts w:ascii="Courier New" w:eastAsia="Times New Roman" w:hAnsi="Courier New" w:cs="Courier New"/>
+          <w:color w:val="CF8E6D"/>
+          <w:kern w:val="0"/>
+          <w:sz w:val="20"/>
+          <w:szCs w:val="20"/>
+          <w:lang w:val="en-US" w:eastAsia="ru-RU"/>
+          <w14:ligatures w14:val="none"/>
+        </w:rPr>
+        <w:t xml:space="preserve">INSERT INTO </w:t>
+      </w:r>
+      <w:r>
+        <w:rPr>
+          <w:rFonts w:ascii="Courier New" w:eastAsia="Times New Roman" w:hAnsi="Courier New" w:cs="Courier New"/>
+          <w:color w:val="BCBEC4"/>
+          <w:kern w:val="0"/>
+          <w:sz w:val="20"/>
+          <w:szCs w:val="20"/>
+          <w:lang w:val="en-US" w:eastAsia="ru-RU"/>
+          <w14:ligatures w14:val="none"/>
+        </w:rPr>
+        <w:t>typographies(</w:t>
+      </w:r>
+      <w:r>
+        <w:rPr>
+          <w:rFonts w:ascii="Courier New" w:eastAsia="Times New Roman" w:hAnsi="Courier New" w:cs="Courier New"/>
+          <w:color w:val="C77DBB"/>
+          <w:kern w:val="0"/>
+          <w:sz w:val="20"/>
+          <w:szCs w:val="20"/>
+          <w:lang w:val="en-US" w:eastAsia="ru-RU"/>
+          <w14:ligatures w14:val="none"/>
+        </w:rPr>
+        <w:t>name</w:t>
+      </w:r>
+      <w:r>
+        <w:rPr>
+          <w:rFonts w:ascii="Courier New" w:eastAsia="Times New Roman" w:hAnsi="Courier New" w:cs="Courier New"/>
+          <w:color w:val="BCBEC4"/>
+          <w:kern w:val="0"/>
+          <w:sz w:val="20"/>
+          <w:szCs w:val="20"/>
+          <w:lang w:val="en-US" w:eastAsia="ru-RU"/>
+          <w14:ligatures w14:val="none"/>
+        </w:rPr>
+        <w:t xml:space="preserve">, </w:t>
+      </w:r>
+      <w:r>
+        <w:rPr>
+          <w:rFonts w:ascii="Courier New" w:eastAsia="Times New Roman" w:hAnsi="Courier New" w:cs="Courier New"/>
+          <w:color w:val="C77DBB"/>
+          <w:kern w:val="0"/>
+          <w:sz w:val="20"/>
+          <w:szCs w:val="20"/>
+          <w:lang w:val="en-US" w:eastAsia="ru-RU"/>
+          <w14:ligatures w14:val="none"/>
+        </w:rPr>
+        <w:t>addr</w:t>
+      </w:r>
+      <w:r>
+        <w:rPr>
+          <w:rFonts w:ascii="Courier New" w:eastAsia="Times New Roman" w:hAnsi="Courier New" w:cs="Courier New"/>
+          <w:color w:val="BCBEC4"/>
+          <w:kern w:val="0"/>
+          <w:sz w:val="20"/>
+          <w:szCs w:val="20"/>
+          <w:lang w:val="en-US" w:eastAsia="ru-RU"/>
+          <w14:ligatures w14:val="none"/>
+        </w:rPr>
+        <w:t xml:space="preserve">, </w:t>
+      </w:r>
+      <w:r>
+        <w:rPr>
+          <w:rFonts w:ascii="Courier New" w:eastAsia="Times New Roman" w:hAnsi="Courier New" w:cs="Courier New"/>
+          <w:color w:val="C77DBB"/>
+          <w:kern w:val="0"/>
+          <w:sz w:val="20"/>
+          <w:szCs w:val="20"/>
+          <w:lang w:val="en-US" w:eastAsia="ru-RU"/>
+          <w14:ligatures w14:val="none"/>
+        </w:rPr>
+        <w:t>tel</w:t>
+      </w:r>
+      <w:r>
+        <w:rPr>
+          <w:rFonts w:ascii="Courier New" w:eastAsia="Times New Roman" w:hAnsi="Courier New" w:cs="Courier New"/>
+          <w:color w:val="BCBEC4"/>
+          <w:kern w:val="0"/>
+          <w:sz w:val="20"/>
+          <w:szCs w:val="20"/>
+          <w:lang w:val="en-US" w:eastAsia="ru-RU"/>
+          <w14:ligatures w14:val="none"/>
+        </w:rPr>
+        <w:t>)</w:t>
+      </w:r>
+      <w:r>
+        <w:rPr>
+          <w:rFonts w:ascii="Courier New" w:eastAsia="Times New Roman" w:hAnsi="Courier New" w:cs="Courier New"/>
+          <w:color w:val="BCBEC4"/>
+          <w:kern w:val="0"/>
+          <w:sz w:val="20"/>
+          <w:szCs w:val="20"/>
+          <w:lang w:val="en-US" w:eastAsia="ru-RU"/>
+          <w14:ligatures w14:val="none"/>
+        </w:rPr>
+        <w:br/>
+      </w:r>
+      <w:r>
+        <w:rPr>
+          <w:rFonts w:ascii="Courier New" w:eastAsia="Times New Roman" w:hAnsi="Courier New" w:cs="Courier New"/>
+          <w:color w:val="CF8E6D"/>
+          <w:kern w:val="0"/>
+          <w:sz w:val="20"/>
+          <w:szCs w:val="20"/>
+          <w:lang w:val="en-US" w:eastAsia="ru-RU"/>
+          <w14:ligatures w14:val="none"/>
+        </w:rPr>
+        <w:t xml:space="preserve">SELECT DISTINCT </w:t>
+      </w:r>
+      <w:r>
+        <w:rPr>
+          <w:rFonts w:ascii="Courier New" w:eastAsia="Times New Roman" w:hAnsi="Courier New" w:cs="Courier New"/>
+          <w:color w:val="C77DBB"/>
+          <w:kern w:val="0"/>
+          <w:sz w:val="20"/>
+          <w:szCs w:val="20"/>
+          <w:lang w:val="en-US" w:eastAsia="ru-RU"/>
+          <w14:ligatures w14:val="none"/>
+        </w:rPr>
+        <w:t>typography_name</w:t>
+      </w:r>
+      <w:r>
+        <w:rPr>
+          <w:rFonts w:ascii="Courier New" w:eastAsia="Times New Roman" w:hAnsi="Courier New" w:cs="Courier New"/>
+          <w:color w:val="BCBEC4"/>
+          <w:kern w:val="0"/>
+          <w:sz w:val="20"/>
+          <w:szCs w:val="20"/>
+          <w:lang w:val="en-US" w:eastAsia="ru-RU"/>
+          <w14:ligatures w14:val="none"/>
+        </w:rPr>
+        <w:t xml:space="preserve">, </w:t>
+      </w:r>
+      <w:r>
+        <w:rPr>
+          <w:rFonts w:ascii="Courier New" w:eastAsia="Times New Roman" w:hAnsi="Courier New" w:cs="Courier New"/>
+          <w:color w:val="C77DBB"/>
+          <w:kern w:val="0"/>
+          <w:sz w:val="20"/>
+          <w:szCs w:val="20"/>
+          <w:lang w:val="en-US" w:eastAsia="ru-RU"/>
+          <w14:ligatures w14:val="none"/>
+        </w:rPr>
+        <w:t>typography_addr</w:t>
+      </w:r>
+      <w:r>
+        <w:rPr>
+          <w:rFonts w:ascii="Courier New" w:eastAsia="Times New Roman" w:hAnsi="Courier New" w:cs="Courier New"/>
+          <w:color w:val="BCBEC4"/>
+          <w:kern w:val="0"/>
+          <w:sz w:val="20"/>
+          <w:szCs w:val="20"/>
+          <w:lang w:val="en-US" w:eastAsia="ru-RU"/>
+          <w14:ligatures w14:val="none"/>
+        </w:rPr>
+        <w:t xml:space="preserve">, </w:t>
+      </w:r>
+      <w:r>
+        <w:rPr>
+          <w:rFonts w:ascii="Courier New" w:eastAsia="Times New Roman" w:hAnsi="Courier New" w:cs="Courier New"/>
+          <w:color w:val="C77DBB"/>
+          <w:kern w:val="0"/>
+          <w:sz w:val="20"/>
+          <w:szCs w:val="20"/>
+          <w:lang w:val="en-US" w:eastAsia="ru-RU"/>
+          <w14:ligatures w14:val="none"/>
+        </w:rPr>
+        <w:t>typography_tel</w:t>
+      </w:r>
+      <w:r>
+        <w:rPr>
+          <w:rFonts w:ascii="Courier New" w:eastAsia="Times New Roman" w:hAnsi="Courier New" w:cs="Courier New"/>
+          <w:color w:val="C77DBB"/>
+          <w:kern w:val="0"/>
+          <w:sz w:val="20"/>
+          <w:szCs w:val="20"/>
+          <w:lang w:val="en-US" w:eastAsia="ru-RU"/>
+          <w14:ligatures w14:val="none"/>
+        </w:rPr>
+        <w:br/>
+      </w:r>
+      <w:r>
+        <w:rPr>
+          <w:rFonts w:ascii="Courier New" w:eastAsia="Times New Roman" w:hAnsi="Courier New" w:cs="Courier New"/>
+          <w:color w:val="CF8E6D"/>
+          <w:kern w:val="0"/>
+          <w:sz w:val="20"/>
+          <w:szCs w:val="20"/>
+          <w:lang w:val="en-US" w:eastAsia="ru-RU"/>
+          <w14:ligatures w14:val="none"/>
+        </w:rPr>
+        <w:t xml:space="preserve">FROM </w:t>
+      </w:r>
+      <w:r>
+        <w:rPr>
+          <w:rFonts w:ascii="Courier New" w:eastAsia="Times New Roman" w:hAnsi="Courier New" w:cs="Courier New"/>
+          <w:color w:val="BCBEC4"/>
+          <w:kern w:val="0"/>
+          <w:sz w:val="20"/>
+          <w:szCs w:val="20"/>
+          <w:lang w:val="en-US" w:eastAsia="ru-RU"/>
+          <w14:ligatures w14:val="none"/>
+        </w:rPr>
+        <w:t>orders</w:t>
+      </w:r>
+      <w:r>
+        <w:rPr>
+          <w:rFonts w:ascii="Courier New" w:eastAsia="Times New Roman" w:hAnsi="Courier New" w:cs="Courier New"/>
+          <w:color w:val="BCBEC4"/>
+          <w:kern w:val="0"/>
+          <w:sz w:val="20"/>
+          <w:szCs w:val="20"/>
+          <w:lang w:val="en-US" w:eastAsia="ru-RU"/>
+          <w14:ligatures w14:val="none"/>
+        </w:rPr>
+        <w:br/>
+      </w:r>
+      <w:r>
+        <w:rPr>
+          <w:rFonts w:ascii="Courier New" w:eastAsia="Times New Roman" w:hAnsi="Courier New" w:cs="Courier New"/>
+          <w:color w:val="CF8E6D"/>
+          <w:kern w:val="0"/>
+          <w:sz w:val="20"/>
+          <w:szCs w:val="20"/>
+          <w:lang w:val="en-US" w:eastAsia="ru-RU"/>
+          <w14:ligatures w14:val="none"/>
+        </w:rPr>
+        <w:t xml:space="preserve">WHERE </w:t>
+      </w:r>
+      <w:r>
+        <w:rPr>
+          <w:rFonts w:ascii="Courier New" w:eastAsia="Times New Roman" w:hAnsi="Courier New" w:cs="Courier New"/>
+          <w:color w:val="C77DBB"/>
+          <w:kern w:val="0"/>
+          <w:sz w:val="20"/>
+          <w:szCs w:val="20"/>
+          <w:lang w:val="en-US" w:eastAsia="ru-RU"/>
+          <w14:ligatures w14:val="none"/>
+        </w:rPr>
+        <w:t xml:space="preserve">typography_name </w:t>
+      </w:r>
+      <w:r>
+        <w:rPr>
+          <w:rFonts w:ascii="Courier New" w:eastAsia="Times New Roman" w:hAnsi="Courier New" w:cs="Courier New"/>
+          <w:color w:val="CF8E6D"/>
+          <w:kern w:val="0"/>
+          <w:sz w:val="20"/>
+          <w:szCs w:val="20"/>
+          <w:lang w:val="en-US" w:eastAsia="ru-RU"/>
+          <w14:ligatures w14:val="none"/>
+        </w:rPr>
+        <w:t>IS NOT NULL</w:t>
+      </w:r>
+      <w:r>
+        <w:rPr>
+          <w:rFonts w:ascii="Courier New" w:eastAsia="Times New Roman" w:hAnsi="Courier New" w:cs="Courier New"/>
+          <w:color w:val="CF8E6D"/>
+          <w:kern w:val="0"/>
+          <w:sz w:val="20"/>
+          <w:szCs w:val="20"/>
+          <w:lang w:val="en-US" w:eastAsia="ru-RU"/>
+          <w14:ligatures w14:val="none"/>
+        </w:rPr>
+        <w:br/>
+        <w:t xml:space="preserve">  OR </w:t>
+      </w:r>
+      <w:r>
+        <w:rPr>
+          <w:rFonts w:ascii="Courier New" w:eastAsia="Times New Roman" w:hAnsi="Courier New" w:cs="Courier New"/>
+          <w:color w:val="C77DBB"/>
+          <w:kern w:val="0"/>
+          <w:sz w:val="20"/>
+          <w:szCs w:val="20"/>
+          <w:lang w:val="en-US" w:eastAsia="ru-RU"/>
+          <w14:ligatures w14:val="none"/>
+        </w:rPr>
+        <w:t xml:space="preserve">typography_addr </w:t>
+      </w:r>
+      <w:r>
+        <w:rPr>
+          <w:rFonts w:ascii="Courier New" w:eastAsia="Times New Roman" w:hAnsi="Courier New" w:cs="Courier New"/>
+          <w:color w:val="CF8E6D"/>
+          <w:kern w:val="0"/>
+          <w:sz w:val="20"/>
+          <w:szCs w:val="20"/>
+          <w:lang w:val="en-US" w:eastAsia="ru-RU"/>
+          <w14:ligatures w14:val="none"/>
+        </w:rPr>
+        <w:t>IS NOT NULL</w:t>
+      </w:r>
+      <w:r>
+        <w:rPr>
+          <w:rFonts w:ascii="Courier New" w:eastAsia="Times New Roman" w:hAnsi="Courier New" w:cs="Courier New"/>
+          <w:color w:val="CF8E6D"/>
+          <w:kern w:val="0"/>
+          <w:sz w:val="20"/>
+          <w:szCs w:val="20"/>
+          <w:lang w:val="en-US" w:eastAsia="ru-RU"/>
+          <w14:ligatures w14:val="none"/>
+        </w:rPr>
+        <w:br/>
+        <w:t xml:space="preserve">  OR </w:t>
+      </w:r>
+      <w:r>
+        <w:rPr>
+          <w:rFonts w:ascii="Courier New" w:eastAsia="Times New Roman" w:hAnsi="Courier New" w:cs="Courier New"/>
+          <w:color w:val="C77DBB"/>
+          <w:kern w:val="0"/>
+          <w:sz w:val="20"/>
+          <w:szCs w:val="20"/>
+          <w:lang w:val="en-US" w:eastAsia="ru-RU"/>
+          <w14:ligatures w14:val="none"/>
+        </w:rPr>
+        <w:t xml:space="preserve">typography_tel </w:t>
+      </w:r>
+      <w:r>
+        <w:rPr>
+          <w:rFonts w:ascii="Courier New" w:eastAsia="Times New Roman" w:hAnsi="Courier New" w:cs="Courier New"/>
+          <w:color w:val="CF8E6D"/>
+          <w:kern w:val="0"/>
+          <w:sz w:val="20"/>
+          <w:szCs w:val="20"/>
+          <w:lang w:val="en-US" w:eastAsia="ru-RU"/>
+          <w14:ligatures w14:val="none"/>
+        </w:rPr>
+        <w:t>IS NOT NULL</w:t>
+      </w:r>
+      <w:r>
+        <w:rPr>
+          <w:rFonts w:ascii="Courier New" w:eastAsia="Times New Roman" w:hAnsi="Courier New" w:cs="Courier New"/>
+          <w:color w:val="CF8E6D"/>
+          <w:kern w:val="0"/>
+          <w:sz w:val="20"/>
+          <w:szCs w:val="20"/>
+          <w:lang w:val="en-US" w:eastAsia="ru-RU"/>
+          <w14:ligatures w14:val="none"/>
+        </w:rPr>
+        <w:br/>
+        <w:t>ON CONFLICT DO NOTHING</w:t>
+      </w:r>
+      <w:r>
+        <w:rPr>
+          <w:rFonts w:ascii="Courier New" w:eastAsia="Times New Roman" w:hAnsi="Courier New" w:cs="Courier New"/>
+          <w:color w:val="BCBEC4"/>
+          <w:kern w:val="0"/>
+          <w:sz w:val="20"/>
+          <w:szCs w:val="20"/>
+          <w:lang w:val="en-US" w:eastAsia="ru-RU"/>
+          <w14:ligatures w14:val="none"/>
+        </w:rPr>
+        <w:t>;</w:t>
+      </w:r>
+      <w:r>
+        <w:rPr>
+          <w:rFonts w:ascii="Courier New" w:eastAsia="Times New Roman" w:hAnsi="Courier New" w:cs="Courier New"/>
+          <w:color w:val="BCBEC4"/>
+          <w:kern w:val="0"/>
+          <w:sz w:val="20"/>
+          <w:szCs w:val="20"/>
+          <w:lang w:val="en-US" w:eastAsia="ru-RU"/>
+          <w14:ligatures w14:val="none"/>
+        </w:rPr>
+        <w:br/>
+      </w:r>
+      <w:r>
+        <w:rPr>
+          <w:rFonts w:ascii="Courier New" w:eastAsia="Times New Roman" w:hAnsi="Courier New" w:cs="Courier New"/>
+          <w:color w:val="BCBEC4"/>
+          <w:kern w:val="0"/>
+          <w:sz w:val="20"/>
+          <w:szCs w:val="20"/>
+          <w:lang w:val="en-US" w:eastAsia="ru-RU"/>
+          <w14:ligatures w14:val="none"/>
+        </w:rPr>
+        <w:br/>
+      </w:r>
+      <w:r>
+        <w:rPr>
+          <w:rFonts w:ascii="Courier New" w:eastAsia="Times New Roman" w:hAnsi="Courier New" w:cs="Courier New"/>
+          <w:color w:val="7A7E85"/>
+          <w:kern w:val="0"/>
+          <w:sz w:val="20"/>
+          <w:szCs w:val="20"/>
+          <w:lang w:val="en-US" w:eastAsia="ru-RU"/>
+          <w14:ligatures w14:val="none"/>
+        </w:rPr>
+        <w:t>-- 4. Link orders to typographies</w:t>
+      </w:r>
+      <w:r>
+        <w:rPr>
+          <w:rFonts w:ascii="Courier New" w:eastAsia="Times New Roman" w:hAnsi="Courier New" w:cs="Courier New"/>
+          <w:color w:val="7A7E85"/>
+          <w:kern w:val="0"/>
+          <w:sz w:val="20"/>
+          <w:szCs w:val="20"/>
+          <w:lang w:val="en-US" w:eastAsia="ru-RU"/>
+          <w14:ligatures w14:val="none"/>
+        </w:rPr>
+        <w:br/>
+      </w:r>
+      <w:r>
+        <w:rPr>
+          <w:rFonts w:ascii="Courier New" w:eastAsia="Times New Roman" w:hAnsi="Courier New" w:cs="Courier New"/>
+          <w:color w:val="CF8E6D"/>
+          <w:kern w:val="0"/>
+          <w:sz w:val="20"/>
+          <w:szCs w:val="20"/>
+          <w:lang w:val="en-US" w:eastAsia="ru-RU"/>
+          <w14:ligatures w14:val="none"/>
+        </w:rPr>
+        <w:t xml:space="preserve">UPDATE </w:t>
+      </w:r>
+      <w:r>
+        <w:rPr>
+          <w:rFonts w:ascii="Courier New" w:eastAsia="Times New Roman" w:hAnsi="Courier New" w:cs="Courier New"/>
+          <w:color w:val="BCBEC4"/>
+          <w:kern w:val="0"/>
+          <w:sz w:val="20"/>
+          <w:szCs w:val="20"/>
+          <w:lang w:val="en-US" w:eastAsia="ru-RU"/>
+          <w14:ligatures w14:val="none"/>
+        </w:rPr>
+        <w:t>orders o</w:t>
+      </w:r>
+      <w:r>
+        <w:rPr>
+          <w:rFonts w:ascii="Courier New" w:eastAsia="Times New Roman" w:hAnsi="Courier New" w:cs="Courier New"/>
+          <w:color w:val="BCBEC4"/>
+          <w:kern w:val="0"/>
+          <w:sz w:val="20"/>
+          <w:szCs w:val="20"/>
+          <w:lang w:val="en-US" w:eastAsia="ru-RU"/>
+          <w14:ligatures w14:val="none"/>
+        </w:rPr>
+        <w:br/>
+      </w:r>
+      <w:r>
+        <w:rPr>
+          <w:rFonts w:ascii="Courier New" w:eastAsia="Times New Roman" w:hAnsi="Courier New" w:cs="Courier New"/>
+          <w:color w:val="CF8E6D"/>
+          <w:kern w:val="0"/>
+          <w:sz w:val="20"/>
+          <w:szCs w:val="20"/>
+          <w:lang w:val="en-US" w:eastAsia="ru-RU"/>
+          <w14:ligatures w14:val="none"/>
+        </w:rPr>
+        <w:t xml:space="preserve">SET </w:t>
+      </w:r>
+      <w:r>
+        <w:rPr>
+          <w:rFonts w:ascii="Courier New" w:eastAsia="Times New Roman" w:hAnsi="Courier New" w:cs="Courier New"/>
+          <w:color w:val="C77DBB"/>
+          <w:kern w:val="0"/>
+          <w:sz w:val="20"/>
+          <w:szCs w:val="20"/>
+          <w:lang w:val="en-US" w:eastAsia="ru-RU"/>
+          <w14:ligatures w14:val="none"/>
+        </w:rPr>
+        <w:t xml:space="preserve">typography_id </w:t>
+      </w:r>
+      <w:r>
+        <w:rPr>
+          <w:rFonts w:ascii="Courier New" w:eastAsia="Times New Roman" w:hAnsi="Courier New" w:cs="Courier New"/>
+          <w:color w:val="BCBEC4"/>
+          <w:kern w:val="0"/>
+          <w:sz w:val="20"/>
+          <w:szCs w:val="20"/>
+          <w:lang w:val="en-US" w:eastAsia="ru-RU"/>
+          <w14:ligatures w14:val="none"/>
+        </w:rPr>
+        <w:t>= t.</w:t>
+      </w:r>
+      <w:r>
+        <w:rPr>
+          <w:rFonts w:ascii="Courier New" w:eastAsia="Times New Roman" w:hAnsi="Courier New" w:cs="Courier New"/>
+          <w:color w:val="C77DBB"/>
+          <w:kern w:val="0"/>
+          <w:sz w:val="20"/>
+          <w:szCs w:val="20"/>
+          <w:lang w:val="en-US" w:eastAsia="ru-RU"/>
+          <w14:ligatures w14:val="none"/>
+        </w:rPr>
+        <w:t>id</w:t>
+      </w:r>
+      <w:r>
+        <w:rPr>
+          <w:rFonts w:ascii="Courier New" w:eastAsia="Times New Roman" w:hAnsi="Courier New" w:cs="Courier New"/>
+          <w:color w:val="C77DBB"/>
+          <w:kern w:val="0"/>
+          <w:sz w:val="20"/>
+          <w:szCs w:val="20"/>
+          <w:lang w:val="en-US" w:eastAsia="ru-RU"/>
+          <w14:ligatures w14:val="none"/>
+        </w:rPr>
+        <w:br/>
+      </w:r>
+      <w:r>
+        <w:rPr>
+          <w:rFonts w:ascii="Courier New" w:eastAsia="Times New Roman" w:hAnsi="Courier New" w:cs="Courier New"/>
+          <w:color w:val="CF8E6D"/>
+          <w:kern w:val="0"/>
+          <w:sz w:val="20"/>
+          <w:szCs w:val="20"/>
+          <w:lang w:val="en-US" w:eastAsia="ru-RU"/>
+          <w14:ligatures w14:val="none"/>
+        </w:rPr>
+        <w:t xml:space="preserve">FROM </w:t>
+      </w:r>
+      <w:r>
+        <w:rPr>
+          <w:rFonts w:ascii="Courier New" w:eastAsia="Times New Roman" w:hAnsi="Courier New" w:cs="Courier New"/>
+          <w:color w:val="BCBEC4"/>
+          <w:kern w:val="0"/>
+          <w:sz w:val="20"/>
+          <w:szCs w:val="20"/>
+          <w:lang w:val="en-US" w:eastAsia="ru-RU"/>
+          <w14:ligatures w14:val="none"/>
+        </w:rPr>
+        <w:t>typographies t</w:t>
+      </w:r>
+      <w:r>
+        <w:rPr>
+          <w:rFonts w:ascii="Courier New" w:eastAsia="Times New Roman" w:hAnsi="Courier New" w:cs="Courier New"/>
+          <w:color w:val="BCBEC4"/>
+          <w:kern w:val="0"/>
+          <w:sz w:val="20"/>
+          <w:szCs w:val="20"/>
+          <w:lang w:val="en-US" w:eastAsia="ru-RU"/>
+          <w14:ligatures w14:val="none"/>
+        </w:rPr>
+        <w:br/>
+      </w:r>
+      <w:r>
+        <w:rPr>
+          <w:rFonts w:ascii="Courier New" w:eastAsia="Times New Roman" w:hAnsi="Courier New" w:cs="Courier New"/>
+          <w:color w:val="CF8E6D"/>
+          <w:kern w:val="0"/>
+          <w:sz w:val="20"/>
+          <w:szCs w:val="20"/>
+          <w:lang w:val="en-US" w:eastAsia="ru-RU"/>
+          <w14:ligatures w14:val="none"/>
+        </w:rPr>
+        <w:t xml:space="preserve">WHERE </w:t>
+      </w:r>
+      <w:r>
+        <w:rPr>
+          <w:rFonts w:ascii="Courier New" w:eastAsia="Times New Roman" w:hAnsi="Courier New" w:cs="Courier New"/>
+          <w:color w:val="BCBEC4"/>
+          <w:kern w:val="0"/>
+          <w:sz w:val="20"/>
+          <w:szCs w:val="20"/>
+          <w:lang w:val="en-US" w:eastAsia="ru-RU"/>
+          <w14:ligatures w14:val="none"/>
+        </w:rPr>
+        <w:t>o.</w:t>
+      </w:r>
+      <w:r>
+        <w:rPr>
+          <w:rFonts w:ascii="Courier New" w:eastAsia="Times New Roman" w:hAnsi="Courier New" w:cs="Courier New"/>
+          <w:color w:val="C77DBB"/>
+          <w:kern w:val="0"/>
+          <w:sz w:val="20"/>
+          <w:szCs w:val="20"/>
+          <w:lang w:val="en-US" w:eastAsia="ru-RU"/>
+          <w14:ligatures w14:val="none"/>
+        </w:rPr>
+        <w:t xml:space="preserve">typography_name </w:t>
+      </w:r>
+      <w:r>
+        <w:rPr>
+          <w:rFonts w:ascii="Courier New" w:eastAsia="Times New Roman" w:hAnsi="Courier New" w:cs="Courier New"/>
+          <w:color w:val="BCBEC4"/>
+          <w:kern w:val="0"/>
+          <w:sz w:val="20"/>
+          <w:szCs w:val="20"/>
+          <w:lang w:val="en-US" w:eastAsia="ru-RU"/>
+          <w14:ligatures w14:val="none"/>
+        </w:rPr>
+        <w:t>= t.</w:t>
+      </w:r>
+      <w:r>
+        <w:rPr>
+          <w:rFonts w:ascii="Courier New" w:eastAsia="Times New Roman" w:hAnsi="Courier New" w:cs="Courier New"/>
+          <w:color w:val="C77DBB"/>
+          <w:kern w:val="0"/>
+          <w:sz w:val="20"/>
+          <w:szCs w:val="20"/>
+          <w:lang w:val="en-US" w:eastAsia="ru-RU"/>
+          <w14:ligatures w14:val="none"/>
+        </w:rPr>
+        <w:t>name</w:t>
+      </w:r>
+      <w:r>
+        <w:rPr>
+          <w:rFonts w:ascii="Courier New" w:eastAsia="Times New Roman" w:hAnsi="Courier New" w:cs="Courier New"/>
+          <w:color w:val="C77DBB"/>
+          <w:kern w:val="0"/>
+          <w:sz w:val="20"/>
+          <w:szCs w:val="20"/>
+          <w:lang w:val="en-US" w:eastAsia="ru-RU"/>
+          <w14:ligatures w14:val="none"/>
+        </w:rPr>
+        <w:br/>
+        <w:t xml:space="preserve">  </w:t>
+      </w:r>
+      <w:r>
+        <w:rPr>
+          <w:rFonts w:ascii="Courier New" w:eastAsia="Times New Roman" w:hAnsi="Courier New" w:cs="Courier New"/>
+          <w:color w:val="CF8E6D"/>
+          <w:kern w:val="0"/>
+          <w:sz w:val="20"/>
+          <w:szCs w:val="20"/>
+          <w:lang w:val="en-US" w:eastAsia="ru-RU"/>
+          <w14:ligatures w14:val="none"/>
+        </w:rPr>
+        <w:t xml:space="preserve">AND </w:t>
+      </w:r>
+      <w:r>
+        <w:rPr>
+          <w:rFonts w:ascii="Courier New" w:eastAsia="Times New Roman" w:hAnsi="Courier New" w:cs="Courier New"/>
+          <w:color w:val="BCBEC4"/>
+          <w:kern w:val="0"/>
+          <w:sz w:val="20"/>
+          <w:szCs w:val="20"/>
+          <w:lang w:val="en-US" w:eastAsia="ru-RU"/>
+          <w14:ligatures w14:val="none"/>
+        </w:rPr>
+        <w:t>o.</w:t>
+      </w:r>
+      <w:r>
+        <w:rPr>
+          <w:rFonts w:ascii="Courier New" w:eastAsia="Times New Roman" w:hAnsi="Courier New" w:cs="Courier New"/>
+          <w:color w:val="C77DBB"/>
+          <w:kern w:val="0"/>
+          <w:sz w:val="20"/>
+          <w:szCs w:val="20"/>
+          <w:lang w:val="en-US" w:eastAsia="ru-RU"/>
+          <w14:ligatures w14:val="none"/>
+        </w:rPr>
+        <w:t xml:space="preserve">typography_addr </w:t>
+      </w:r>
+      <w:r>
+        <w:rPr>
+          <w:rFonts w:ascii="Courier New" w:eastAsia="Times New Roman" w:hAnsi="Courier New" w:cs="Courier New"/>
+          <w:color w:val="BCBEC4"/>
+          <w:kern w:val="0"/>
+          <w:sz w:val="20"/>
+          <w:szCs w:val="20"/>
+          <w:lang w:val="en-US" w:eastAsia="ru-RU"/>
+          <w14:ligatures w14:val="none"/>
+        </w:rPr>
+        <w:t>= t.</w:t>
+      </w:r>
+      <w:r>
+        <w:rPr>
+          <w:rFonts w:ascii="Courier New" w:eastAsia="Times New Roman" w:hAnsi="Courier New" w:cs="Courier New"/>
+          <w:color w:val="C77DBB"/>
+          <w:kern w:val="0"/>
+          <w:sz w:val="20"/>
+          <w:szCs w:val="20"/>
+          <w:lang w:val="en-US" w:eastAsia="ru-RU"/>
+          <w14:ligatures w14:val="none"/>
+        </w:rPr>
+        <w:t>addr</w:t>
+      </w:r>
+      <w:r>
+        <w:rPr>
+          <w:rFonts w:ascii="Courier New" w:eastAsia="Times New Roman" w:hAnsi="Courier New" w:cs="Courier New"/>
+          <w:color w:val="C77DBB"/>
+          <w:kern w:val="0"/>
+          <w:sz w:val="20"/>
+          <w:szCs w:val="20"/>
+          <w:lang w:val="en-US" w:eastAsia="ru-RU"/>
+          <w14:ligatures w14:val="none"/>
+        </w:rPr>
+        <w:br/>
+        <w:t xml:space="preserve">  </w:t>
+      </w:r>
+      <w:r>
+        <w:rPr>
+          <w:rFonts w:ascii="Courier New" w:eastAsia="Times New Roman" w:hAnsi="Courier New" w:cs="Courier New"/>
+          <w:color w:val="CF8E6D"/>
+          <w:kern w:val="0"/>
+          <w:sz w:val="20"/>
+          <w:szCs w:val="20"/>
+          <w:lang w:val="en-US" w:eastAsia="ru-RU"/>
+          <w14:ligatures w14:val="none"/>
+        </w:rPr>
+        <w:t xml:space="preserve">AND </w:t>
+      </w:r>
+      <w:r>
+        <w:rPr>
+          <w:rFonts w:ascii="Courier New" w:eastAsia="Times New Roman" w:hAnsi="Courier New" w:cs="Courier New"/>
+          <w:color w:val="BCBEC4"/>
+          <w:kern w:val="0"/>
+          <w:sz w:val="20"/>
+          <w:szCs w:val="20"/>
+          <w:lang w:val="en-US" w:eastAsia="ru-RU"/>
+          <w14:ligatures w14:val="none"/>
+        </w:rPr>
+        <w:t>o.</w:t>
+      </w:r>
+      <w:r>
+        <w:rPr>
+          <w:rFonts w:ascii="Courier New" w:eastAsia="Times New Roman" w:hAnsi="Courier New" w:cs="Courier New"/>
+          <w:color w:val="C77DBB"/>
+          <w:kern w:val="0"/>
+          <w:sz w:val="20"/>
+          <w:szCs w:val="20"/>
+          <w:lang w:val="en-US" w:eastAsia="ru-RU"/>
+          <w14:ligatures w14:val="none"/>
+        </w:rPr>
+        <w:t xml:space="preserve">typography_tel </w:t>
+      </w:r>
+      <w:r>
+        <w:rPr>
+          <w:rFonts w:ascii="Courier New" w:eastAsia="Times New Roman" w:hAnsi="Courier New" w:cs="Courier New"/>
+          <w:color w:val="BCBEC4"/>
+          <w:kern w:val="0"/>
+          <w:sz w:val="20"/>
+          <w:szCs w:val="20"/>
+          <w:lang w:val="en-US" w:eastAsia="ru-RU"/>
+          <w14:ligatures w14:val="none"/>
+        </w:rPr>
+        <w:t>= t.</w:t>
+      </w:r>
+      <w:r>
+        <w:rPr>
+          <w:rFonts w:ascii="Courier New" w:eastAsia="Times New Roman" w:hAnsi="Courier New" w:cs="Courier New"/>
+          <w:color w:val="C77DBB"/>
+          <w:kern w:val="0"/>
+          <w:sz w:val="20"/>
+          <w:szCs w:val="20"/>
+          <w:lang w:val="en-US" w:eastAsia="ru-RU"/>
+          <w14:ligatures w14:val="none"/>
+        </w:rPr>
+        <w:t>tel</w:t>
+      </w:r>
+      <w:r>
+        <w:rPr>
+          <w:rFonts w:ascii="Courier New" w:eastAsia="Times New Roman" w:hAnsi="Courier New" w:cs="Courier New"/>
+          <w:color w:val="C77DBB"/>
+          <w:kern w:val="0"/>
+          <w:sz w:val="20"/>
+          <w:szCs w:val="20"/>
+          <w:lang w:val="en-US" w:eastAsia="ru-RU"/>
+          <w14:ligatures w14:val="none"/>
+        </w:rPr>
+        <w:br/>
+        <w:t xml:space="preserve">  </w:t>
+      </w:r>
+      <w:r>
+        <w:rPr>
+          <w:rFonts w:ascii="Courier New" w:eastAsia="Times New Roman" w:hAnsi="Courier New" w:cs="Courier New"/>
+          <w:color w:val="CF8E6D"/>
+          <w:kern w:val="0"/>
+          <w:sz w:val="20"/>
+          <w:szCs w:val="20"/>
+          <w:lang w:val="en-US" w:eastAsia="ru-RU"/>
+          <w14:ligatures w14:val="none"/>
+        </w:rPr>
+        <w:t xml:space="preserve">AND </w:t>
+      </w:r>
+      <w:r>
+        <w:rPr>
+          <w:rFonts w:ascii="Courier New" w:eastAsia="Times New Roman" w:hAnsi="Courier New" w:cs="Courier New"/>
+          <w:color w:val="BCBEC4"/>
+          <w:kern w:val="0"/>
+          <w:sz w:val="20"/>
+          <w:szCs w:val="20"/>
+          <w:lang w:val="en-US" w:eastAsia="ru-RU"/>
+          <w14:ligatures w14:val="none"/>
+        </w:rPr>
+        <w:t>o.</w:t>
+      </w:r>
+      <w:r>
+        <w:rPr>
+          <w:rFonts w:ascii="Courier New" w:eastAsia="Times New Roman" w:hAnsi="Courier New" w:cs="Courier New"/>
+          <w:color w:val="C77DBB"/>
+          <w:kern w:val="0"/>
+          <w:sz w:val="20"/>
+          <w:szCs w:val="20"/>
+          <w:lang w:val="en-US" w:eastAsia="ru-RU"/>
+          <w14:ligatures w14:val="none"/>
+        </w:rPr>
+        <w:t xml:space="preserve">typography_id </w:t>
+      </w:r>
+      <w:r>
+        <w:rPr>
+          <w:rFonts w:ascii="Courier New" w:eastAsia="Times New Roman" w:hAnsi="Courier New" w:cs="Courier New"/>
+          <w:color w:val="CF8E6D"/>
+          <w:kern w:val="0"/>
+          <w:sz w:val="20"/>
+          <w:szCs w:val="20"/>
+          <w:lang w:val="en-US" w:eastAsia="ru-RU"/>
+          <w14:ligatures w14:val="none"/>
+        </w:rPr>
+        <w:t>IS NULL</w:t>
+      </w:r>
+      <w:r>
+        <w:rPr>
+          <w:rFonts w:ascii="Courier New" w:eastAsia="Times New Roman" w:hAnsi="Courier New" w:cs="Courier New"/>
+          <w:color w:val="BCBEC4"/>
+          <w:kern w:val="0"/>
+          <w:sz w:val="20"/>
+          <w:szCs w:val="20"/>
+          <w:lang w:val="en-US" w:eastAsia="ru-RU"/>
+          <w14:ligatures w14:val="none"/>
+        </w:rPr>
+        <w:t>;</w:t>
+      </w:r>
+      <w:r>
+        <w:rPr>
+          <w:rFonts w:ascii="Courier New" w:eastAsia="Times New Roman" w:hAnsi="Courier New" w:cs="Courier New"/>
+          <w:color w:val="BCBEC4"/>
+          <w:kern w:val="0"/>
+          <w:sz w:val="20"/>
+          <w:szCs w:val="20"/>
+          <w:lang w:val="en-US" w:eastAsia="ru-RU"/>
+          <w14:ligatures w14:val="none"/>
+        </w:rPr>
+        <w:br/>
+      </w:r>
+      <w:r>
+        <w:rPr>
+          <w:rFonts w:ascii="Courier New" w:eastAsia="Times New Roman" w:hAnsi="Courier New" w:cs="Courier New"/>
+          <w:color w:val="BCBEC4"/>
+          <w:kern w:val="0"/>
+          <w:sz w:val="20"/>
+          <w:szCs w:val="20"/>
+          <w:lang w:val="en-US" w:eastAsia="ru-RU"/>
+          <w14:ligatures w14:val="none"/>
+        </w:rPr>
+        <w:br/>
+      </w:r>
+      <w:r>
+        <w:rPr>
+          <w:rFonts w:ascii="Courier New" w:eastAsia="Times New Roman" w:hAnsi="Courier New" w:cs="Courier New"/>
+          <w:color w:val="7A7E85"/>
+          <w:kern w:val="0"/>
+          <w:sz w:val="20"/>
+          <w:szCs w:val="20"/>
+          <w:lang w:val="en-US" w:eastAsia="ru-RU"/>
+          <w14:ligatures w14:val="none"/>
+        </w:rPr>
+        <w:t>-- 5. Enforce foreign key once data is aligned (guard if rerun)</w:t>
+      </w:r>
+      <w:r>
+        <w:rPr>
+          <w:rFonts w:ascii="Courier New" w:eastAsia="Times New Roman" w:hAnsi="Courier New" w:cs="Courier New"/>
+          <w:color w:val="7A7E85"/>
+          <w:kern w:val="0"/>
+          <w:sz w:val="20"/>
+          <w:szCs w:val="20"/>
+          <w:lang w:val="en-US" w:eastAsia="ru-RU"/>
+          <w14:ligatures w14:val="none"/>
+        </w:rPr>
+        <w:br/>
+      </w:r>
+      <w:r>
+        <w:rPr>
+          <w:rFonts w:ascii="Courier New" w:eastAsia="Times New Roman" w:hAnsi="Courier New" w:cs="Courier New"/>
+          <w:color w:val="CF8E6D"/>
+          <w:kern w:val="0"/>
+          <w:sz w:val="20"/>
+          <w:szCs w:val="20"/>
+          <w:lang w:val="en-US" w:eastAsia="ru-RU"/>
+          <w14:ligatures w14:val="none"/>
+        </w:rPr>
+        <w:t xml:space="preserve">DO </w:t>
+      </w:r>
+      <w:r>
+        <w:rPr>
+          <w:rFonts w:ascii="Courier New" w:eastAsia="Times New Roman" w:hAnsi="Courier New" w:cs="Courier New"/>
+          <w:color w:val="6AAB73"/>
+          <w:kern w:val="0"/>
+          <w:sz w:val="20"/>
+          <w:szCs w:val="20"/>
+          <w:lang w:val="en-US" w:eastAsia="ru-RU"/>
+          <w14:ligatures w14:val="none"/>
+        </w:rPr>
+        <w:t>$$</w:t>
+      </w:r>
+      <w:r>
+        <w:rPr>
+          <w:rFonts w:ascii="Courier New" w:eastAsia="Times New Roman" w:hAnsi="Courier New" w:cs="Courier New"/>
+          <w:color w:val="6AAB73"/>
+          <w:kern w:val="0"/>
+          <w:sz w:val="20"/>
+          <w:szCs w:val="20"/>
+          <w:lang w:val="en-US" w:eastAsia="ru-RU"/>
+          <w14:ligatures w14:val="none"/>
+        </w:rPr>
+        <w:br/>
+      </w:r>
+      <w:r>
+        <w:rPr>
+          <w:rFonts w:ascii="Courier New" w:eastAsia="Times New Roman" w:hAnsi="Courier New" w:cs="Courier New"/>
+          <w:color w:val="CF8E6D"/>
+          <w:kern w:val="0"/>
+          <w:sz w:val="20"/>
+          <w:szCs w:val="20"/>
+          <w:lang w:val="en-US" w:eastAsia="ru-RU"/>
+          <w14:ligatures w14:val="none"/>
+        </w:rPr>
+        <w:t>BEGIN</w:t>
+      </w:r>
+      <w:r>
+        <w:rPr>
+          <w:rFonts w:ascii="Courier New" w:eastAsia="Times New Roman" w:hAnsi="Courier New" w:cs="Courier New"/>
+          <w:color w:val="CF8E6D"/>
+          <w:kern w:val="0"/>
+          <w:sz w:val="20"/>
+          <w:szCs w:val="20"/>
+          <w:lang w:val="en-US" w:eastAsia="ru-RU"/>
+          <w14:ligatures w14:val="none"/>
+        </w:rPr>
+        <w:br/>
+        <w:t xml:space="preserve">  IF NOT </w:t>
+      </w:r>
+      <w:r>
+        <w:rPr>
+          <w:rFonts w:ascii="Courier New" w:eastAsia="Times New Roman" w:hAnsi="Courier New" w:cs="Courier New"/>
+          <w:i/>
+          <w:iCs/>
+          <w:color w:val="57AAF7"/>
+          <w:kern w:val="0"/>
+          <w:sz w:val="20"/>
+          <w:szCs w:val="20"/>
+          <w:lang w:val="en-US" w:eastAsia="ru-RU"/>
+          <w14:ligatures w14:val="none"/>
+        </w:rPr>
+        <w:t xml:space="preserve">EXISTS </w:t>
+      </w:r>
+      <w:r>
+        <w:rPr>
+          <w:rFonts w:ascii="Courier New" w:eastAsia="Times New Roman" w:hAnsi="Courier New" w:cs="Courier New"/>
+          <w:color w:val="BCBEC4"/>
+          <w:kern w:val="0"/>
+          <w:sz w:val="20"/>
+          <w:szCs w:val="20"/>
+          <w:lang w:val="en-US" w:eastAsia="ru-RU"/>
+          <w14:ligatures w14:val="none"/>
+        </w:rPr>
+        <w:t>(</w:t>
+      </w:r>
+      <w:r>
+        <w:rPr>
+          <w:rFonts w:ascii="Courier New" w:eastAsia="Times New Roman" w:hAnsi="Courier New" w:cs="Courier New"/>
+          <w:color w:val="BCBEC4"/>
+          <w:kern w:val="0"/>
+          <w:sz w:val="20"/>
+          <w:szCs w:val="20"/>
+          <w:lang w:val="en-US" w:eastAsia="ru-RU"/>
+          <w14:ligatures w14:val="none"/>
+        </w:rPr>
+        <w:br/>
+        <w:t xml:space="preserve">    </w:t>
+      </w:r>
+      <w:r>
+        <w:rPr>
+          <w:rFonts w:ascii="Courier New" w:eastAsia="Times New Roman" w:hAnsi="Courier New" w:cs="Courier New"/>
+          <w:color w:val="CF8E6D"/>
+          <w:kern w:val="0"/>
+          <w:sz w:val="20"/>
+          <w:szCs w:val="20"/>
+          <w:lang w:val="en-US" w:eastAsia="ru-RU"/>
+          <w14:ligatures w14:val="none"/>
+        </w:rPr>
+        <w:t xml:space="preserve">SELECT </w:t>
+      </w:r>
+      <w:r>
+        <w:rPr>
+          <w:rFonts w:ascii="Courier New" w:eastAsia="Times New Roman" w:hAnsi="Courier New" w:cs="Courier New"/>
+          <w:color w:val="2AACB8"/>
+          <w:kern w:val="0"/>
+          <w:sz w:val="20"/>
+          <w:szCs w:val="20"/>
+          <w:lang w:val="en-US" w:eastAsia="ru-RU"/>
+          <w14:ligatures w14:val="none"/>
+        </w:rPr>
+        <w:t xml:space="preserve">1 </w:t>
+      </w:r>
+      <w:r>
+        <w:rPr>
+          <w:rFonts w:ascii="Courier New" w:eastAsia="Times New Roman" w:hAnsi="Courier New" w:cs="Courier New"/>
+          <w:color w:val="CF8E6D"/>
+          <w:kern w:val="0"/>
+          <w:sz w:val="20"/>
+          <w:szCs w:val="20"/>
+          <w:lang w:val="en-US" w:eastAsia="ru-RU"/>
+          <w14:ligatures w14:val="none"/>
+        </w:rPr>
+        <w:t xml:space="preserve">FROM </w:t>
+      </w:r>
+      <w:r>
+        <w:rPr>
+          <w:rFonts w:ascii="Courier New" w:eastAsia="Times New Roman" w:hAnsi="Courier New" w:cs="Courier New"/>
+          <w:color w:val="BCBEC4"/>
+          <w:kern w:val="0"/>
+          <w:sz w:val="20"/>
+          <w:szCs w:val="20"/>
+          <w:lang w:val="en-US" w:eastAsia="ru-RU"/>
+          <w14:ligatures w14:val="none"/>
+        </w:rPr>
+        <w:t>pg_constraint</w:t>
+      </w:r>
+      <w:r>
+        <w:rPr>
+          <w:rFonts w:ascii="Courier New" w:eastAsia="Times New Roman" w:hAnsi="Courier New" w:cs="Courier New"/>
+          <w:color w:val="BCBEC4"/>
+          <w:kern w:val="0"/>
+          <w:sz w:val="20"/>
+          <w:szCs w:val="20"/>
+          <w:lang w:val="en-US" w:eastAsia="ru-RU"/>
+          <w14:ligatures w14:val="none"/>
+        </w:rPr>
+        <w:br/>
+        <w:t xml:space="preserve">    </w:t>
+      </w:r>
+      <w:r>
+        <w:rPr>
+          <w:rFonts w:ascii="Courier New" w:eastAsia="Times New Roman" w:hAnsi="Courier New" w:cs="Courier New"/>
+          <w:color w:val="CF8E6D"/>
+          <w:kern w:val="0"/>
+          <w:sz w:val="20"/>
+          <w:szCs w:val="20"/>
+          <w:lang w:val="en-US" w:eastAsia="ru-RU"/>
+          <w14:ligatures w14:val="none"/>
+        </w:rPr>
+        <w:t xml:space="preserve">WHERE </w:t>
+      </w:r>
+      <w:r>
+        <w:rPr>
+          <w:rFonts w:ascii="Courier New" w:eastAsia="Times New Roman" w:hAnsi="Courier New" w:cs="Courier New"/>
+          <w:color w:val="C77DBB"/>
+          <w:kern w:val="0"/>
+          <w:sz w:val="20"/>
+          <w:szCs w:val="20"/>
+          <w:lang w:val="en-US" w:eastAsia="ru-RU"/>
+          <w14:ligatures w14:val="none"/>
+        </w:rPr>
+        <w:t xml:space="preserve">conname </w:t>
+      </w:r>
+      <w:r>
+        <w:rPr>
+          <w:rFonts w:ascii="Courier New" w:eastAsia="Times New Roman" w:hAnsi="Courier New" w:cs="Courier New"/>
+          <w:color w:val="BCBEC4"/>
+          <w:kern w:val="0"/>
+          <w:sz w:val="20"/>
+          <w:szCs w:val="20"/>
+          <w:lang w:val="en-US" w:eastAsia="ru-RU"/>
+          <w14:ligatures w14:val="none"/>
+        </w:rPr>
+        <w:t xml:space="preserve">= </w:t>
+      </w:r>
+      <w:r>
+        <w:rPr>
+          <w:rFonts w:ascii="Courier New" w:eastAsia="Times New Roman" w:hAnsi="Courier New" w:cs="Courier New"/>
+          <w:color w:val="6AAB73"/>
+          <w:kern w:val="0"/>
+          <w:sz w:val="20"/>
+          <w:szCs w:val="20"/>
+          <w:lang w:val="en-US" w:eastAsia="ru-RU"/>
+          <w14:ligatures w14:val="none"/>
+        </w:rPr>
+        <w:t>'fk_orders_typography'</w:t>
+      </w:r>
+      <w:r>
+        <w:rPr>
+          <w:rFonts w:ascii="Courier New" w:eastAsia="Times New Roman" w:hAnsi="Courier New" w:cs="Courier New"/>
+          <w:color w:val="6AAB73"/>
+          <w:kern w:val="0"/>
+          <w:sz w:val="20"/>
+          <w:szCs w:val="20"/>
+          <w:lang w:val="en-US" w:eastAsia="ru-RU"/>
+          <w14:ligatures w14:val="none"/>
+        </w:rPr>
+        <w:br/>
+        <w:t xml:space="preserve">  </w:t>
+      </w:r>
+      <w:r>
+        <w:rPr>
+          <w:rFonts w:ascii="Courier New" w:eastAsia="Times New Roman" w:hAnsi="Courier New" w:cs="Courier New"/>
+          <w:color w:val="BCBEC4"/>
+          <w:kern w:val="0"/>
+          <w:sz w:val="20"/>
+          <w:szCs w:val="20"/>
+          <w:lang w:val="en-US" w:eastAsia="ru-RU"/>
+          <w14:ligatures w14:val="none"/>
+        </w:rPr>
+        <w:t xml:space="preserve">) </w:t>
+      </w:r>
+      <w:r>
+        <w:rPr>
+          <w:rFonts w:ascii="Courier New" w:eastAsia="Times New Roman" w:hAnsi="Courier New" w:cs="Courier New"/>
+          <w:color w:val="CF8E6D"/>
+          <w:kern w:val="0"/>
+          <w:sz w:val="20"/>
+          <w:szCs w:val="20"/>
+          <w:lang w:val="en-US" w:eastAsia="ru-RU"/>
+          <w14:ligatures w14:val="none"/>
+        </w:rPr>
+        <w:t>THEN</w:t>
+      </w:r>
+      <w:r>
+        <w:rPr>
+          <w:rFonts w:ascii="Courier New" w:eastAsia="Times New Roman" w:hAnsi="Courier New" w:cs="Courier New"/>
+          <w:color w:val="CF8E6D"/>
+          <w:kern w:val="0"/>
+          <w:sz w:val="20"/>
+          <w:szCs w:val="20"/>
+          <w:lang w:val="en-US" w:eastAsia="ru-RU"/>
+          <w14:ligatures w14:val="none"/>
+        </w:rPr>
+        <w:br/>
+        <w:t xml:space="preserve">    ALTER TABLE </w:t>
+      </w:r>
+      <w:r>
+        <w:rPr>
+          <w:rFonts w:ascii="Courier New" w:eastAsia="Times New Roman" w:hAnsi="Courier New" w:cs="Courier New"/>
+          <w:color w:val="BCBEC4"/>
+          <w:kern w:val="0"/>
+          <w:sz w:val="20"/>
+          <w:szCs w:val="20"/>
+          <w:lang w:val="en-US" w:eastAsia="ru-RU"/>
+          <w14:ligatures w14:val="none"/>
+        </w:rPr>
+        <w:t>orders</w:t>
+      </w:r>
+      <w:r>
+        <w:rPr>
+          <w:rFonts w:ascii="Courier New" w:eastAsia="Times New Roman" w:hAnsi="Courier New" w:cs="Courier New"/>
+          <w:color w:val="BCBEC4"/>
+          <w:kern w:val="0"/>
+          <w:sz w:val="20"/>
+          <w:szCs w:val="20"/>
+          <w:lang w:val="en-US" w:eastAsia="ru-RU"/>
+          <w14:ligatures w14:val="none"/>
+        </w:rPr>
+        <w:br/>
+        <w:t xml:space="preserve">      </w:t>
+      </w:r>
+      <w:r>
+        <w:rPr>
+          <w:rFonts w:ascii="Courier New" w:eastAsia="Times New Roman" w:hAnsi="Courier New" w:cs="Courier New"/>
+          <w:color w:val="CF8E6D"/>
+          <w:kern w:val="0"/>
+          <w:sz w:val="20"/>
+          <w:szCs w:val="20"/>
+          <w:lang w:val="en-US" w:eastAsia="ru-RU"/>
+          <w14:ligatures w14:val="none"/>
+        </w:rPr>
+        <w:t xml:space="preserve">ADD CONSTRAINT </w:t>
+      </w:r>
+      <w:r>
+        <w:rPr>
+          <w:rFonts w:ascii="Courier New" w:eastAsia="Times New Roman" w:hAnsi="Courier New" w:cs="Courier New"/>
+          <w:color w:val="BCBEC4"/>
+          <w:kern w:val="0"/>
+          <w:sz w:val="20"/>
+          <w:szCs w:val="20"/>
+          <w:lang w:val="en-US" w:eastAsia="ru-RU"/>
+          <w14:ligatures w14:val="none"/>
+        </w:rPr>
+        <w:t xml:space="preserve">fk_orders_typography </w:t>
+      </w:r>
+      <w:r>
+        <w:rPr>
+          <w:rFonts w:ascii="Courier New" w:eastAsia="Times New Roman" w:hAnsi="Courier New" w:cs="Courier New"/>
+          <w:color w:val="CF8E6D"/>
+          <w:kern w:val="0"/>
+          <w:sz w:val="20"/>
+          <w:szCs w:val="20"/>
+          <w:lang w:val="en-US" w:eastAsia="ru-RU"/>
+          <w14:ligatures w14:val="none"/>
+        </w:rPr>
+        <w:t>FOREIGN KEY</w:t>
+      </w:r>
+      <w:r>
+        <w:rPr>
+          <w:rFonts w:ascii="Courier New" w:eastAsia="Times New Roman" w:hAnsi="Courier New" w:cs="Courier New"/>
+          <w:color w:val="BCBEC4"/>
+          <w:kern w:val="0"/>
+          <w:sz w:val="20"/>
+          <w:szCs w:val="20"/>
+          <w:lang w:val="en-US" w:eastAsia="ru-RU"/>
+          <w14:ligatures w14:val="none"/>
+        </w:rPr>
+        <w:t>(</w:t>
+      </w:r>
+      <w:r>
+        <w:rPr>
+          <w:rFonts w:ascii="Courier New" w:eastAsia="Times New Roman" w:hAnsi="Courier New" w:cs="Courier New"/>
+          <w:color w:val="C77DBB"/>
+          <w:kern w:val="0"/>
+          <w:sz w:val="20"/>
+          <w:szCs w:val="20"/>
+          <w:lang w:val="en-US" w:eastAsia="ru-RU"/>
+          <w14:ligatures w14:val="none"/>
+        </w:rPr>
+        <w:t>typography_id</w:t>
+      </w:r>
+      <w:r>
+        <w:rPr>
+          <w:rFonts w:ascii="Courier New" w:eastAsia="Times New Roman" w:hAnsi="Courier New" w:cs="Courier New"/>
+          <w:color w:val="BCBEC4"/>
+          <w:kern w:val="0"/>
+          <w:sz w:val="20"/>
+          <w:szCs w:val="20"/>
+          <w:lang w:val="en-US" w:eastAsia="ru-RU"/>
+          <w14:ligatures w14:val="none"/>
+        </w:rPr>
+        <w:t>)</w:t>
+      </w:r>
+      <w:r>
+        <w:rPr>
+          <w:rFonts w:ascii="Courier New" w:eastAsia="Times New Roman" w:hAnsi="Courier New" w:cs="Courier New"/>
+          <w:color w:val="BCBEC4"/>
+          <w:kern w:val="0"/>
+          <w:sz w:val="20"/>
+          <w:szCs w:val="20"/>
+          <w:lang w:val="en-US" w:eastAsia="ru-RU"/>
+          <w14:ligatures w14:val="none"/>
+        </w:rPr>
+        <w:br/>
+        <w:t xml:space="preserve">        </w:t>
+      </w:r>
+      <w:r>
+        <w:rPr>
+          <w:rFonts w:ascii="Courier New" w:eastAsia="Times New Roman" w:hAnsi="Courier New" w:cs="Courier New"/>
+          <w:color w:val="CF8E6D"/>
+          <w:kern w:val="0"/>
+          <w:sz w:val="20"/>
+          <w:szCs w:val="20"/>
+          <w:lang w:val="en-US" w:eastAsia="ru-RU"/>
+          <w14:ligatures w14:val="none"/>
+        </w:rPr>
+        <w:t xml:space="preserve">REFERENCES </w:t>
+      </w:r>
+      <w:r>
+        <w:rPr>
+          <w:rFonts w:ascii="Courier New" w:eastAsia="Times New Roman" w:hAnsi="Courier New" w:cs="Courier New"/>
+          <w:color w:val="BCBEC4"/>
+          <w:kern w:val="0"/>
+          <w:sz w:val="20"/>
+          <w:szCs w:val="20"/>
+          <w:lang w:val="en-US" w:eastAsia="ru-RU"/>
+          <w14:ligatures w14:val="none"/>
+        </w:rPr>
+        <w:t>typographies(</w:t>
+      </w:r>
+      <w:r>
+        <w:rPr>
+          <w:rFonts w:ascii="Courier New" w:eastAsia="Times New Roman" w:hAnsi="Courier New" w:cs="Courier New"/>
+          <w:color w:val="C77DBB"/>
+          <w:kern w:val="0"/>
+          <w:sz w:val="20"/>
+          <w:szCs w:val="20"/>
+          <w:lang w:val="en-US" w:eastAsia="ru-RU"/>
+          <w14:ligatures w14:val="none"/>
+        </w:rPr>
+        <w:t>id</w:t>
+      </w:r>
+      <w:r>
+        <w:rPr>
+          <w:rFonts w:ascii="Courier New" w:eastAsia="Times New Roman" w:hAnsi="Courier New" w:cs="Courier New"/>
+          <w:color w:val="BCBEC4"/>
+          <w:kern w:val="0"/>
+          <w:sz w:val="20"/>
+          <w:szCs w:val="20"/>
+          <w:lang w:val="en-US" w:eastAsia="ru-RU"/>
+          <w14:ligatures w14:val="none"/>
+        </w:rPr>
+        <w:t>);</w:t>
+      </w:r>
+      <w:r>
+        <w:rPr>
+          <w:rFonts w:ascii="Courier New" w:eastAsia="Times New Roman" w:hAnsi="Courier New" w:cs="Courier New"/>
+          <w:color w:val="BCBEC4"/>
+          <w:kern w:val="0"/>
+          <w:sz w:val="20"/>
+          <w:szCs w:val="20"/>
+          <w:lang w:val="en-US" w:eastAsia="ru-RU"/>
+          <w14:ligatures w14:val="none"/>
+        </w:rPr>
+        <w:br/>
+        <w:t xml:space="preserve">  </w:t>
+      </w:r>
+      <w:r>
+        <w:rPr>
+          <w:rFonts w:ascii="Courier New" w:eastAsia="Times New Roman" w:hAnsi="Courier New" w:cs="Courier New"/>
+          <w:color w:val="CF8E6D"/>
+          <w:kern w:val="0"/>
+          <w:sz w:val="20"/>
+          <w:szCs w:val="20"/>
+          <w:lang w:val="en-US" w:eastAsia="ru-RU"/>
+          <w14:ligatures w14:val="none"/>
+        </w:rPr>
+        <w:t>END IF</w:t>
+      </w:r>
+      <w:r>
+        <w:rPr>
+          <w:rFonts w:ascii="Courier New" w:eastAsia="Times New Roman" w:hAnsi="Courier New" w:cs="Courier New"/>
+          <w:color w:val="BCBEC4"/>
+          <w:kern w:val="0"/>
+          <w:sz w:val="20"/>
+          <w:szCs w:val="20"/>
+          <w:lang w:val="en-US" w:eastAsia="ru-RU"/>
+          <w14:ligatures w14:val="none"/>
+        </w:rPr>
+        <w:t>;</w:t>
+      </w:r>
+      <w:r>
+        <w:rPr>
+          <w:rFonts w:ascii="Courier New" w:eastAsia="Times New Roman" w:hAnsi="Courier New" w:cs="Courier New"/>
+          <w:color w:val="BCBEC4"/>
+          <w:kern w:val="0"/>
+          <w:sz w:val="20"/>
+          <w:szCs w:val="20"/>
+          <w:lang w:val="en-US" w:eastAsia="ru-RU"/>
+          <w14:ligatures w14:val="none"/>
+        </w:rPr>
+        <w:br/>
+      </w:r>
+      <w:r>
+        <w:rPr>
+          <w:rFonts w:ascii="Courier New" w:eastAsia="Times New Roman" w:hAnsi="Courier New" w:cs="Courier New"/>
+          <w:color w:val="CF8E6D"/>
+          <w:kern w:val="0"/>
+          <w:sz w:val="20"/>
+          <w:szCs w:val="20"/>
+          <w:lang w:val="en-US" w:eastAsia="ru-RU"/>
+          <w14:ligatures w14:val="none"/>
+        </w:rPr>
+        <w:t>END</w:t>
+      </w:r>
+      <w:r>
+        <w:rPr>
+          <w:rFonts w:ascii="Courier New" w:eastAsia="Times New Roman" w:hAnsi="Courier New" w:cs="Courier New"/>
+          <w:color w:val="BCBEC4"/>
+          <w:kern w:val="0"/>
+          <w:sz w:val="20"/>
+          <w:szCs w:val="20"/>
+          <w:lang w:val="en-US" w:eastAsia="ru-RU"/>
+          <w14:ligatures w14:val="none"/>
+        </w:rPr>
+        <w:t>;</w:t>
+      </w:r>
+      <w:r>
+        <w:rPr>
+          <w:rFonts w:ascii="Courier New" w:eastAsia="Times New Roman" w:hAnsi="Courier New" w:cs="Courier New"/>
+          <w:color w:val="BCBEC4"/>
+          <w:kern w:val="0"/>
+          <w:sz w:val="20"/>
+          <w:szCs w:val="20"/>
+          <w:lang w:val="en-US" w:eastAsia="ru-RU"/>
+          <w14:ligatures w14:val="none"/>
+        </w:rPr>
+        <w:br/>
+      </w:r>
+      <w:r>
+        <w:rPr>
+          <w:rFonts w:ascii="Courier New" w:eastAsia="Times New Roman" w:hAnsi="Courier New" w:cs="Courier New"/>
+          <w:color w:val="6AAB73"/>
+          <w:kern w:val="0"/>
+          <w:sz w:val="20"/>
+          <w:szCs w:val="20"/>
+          <w:lang w:val="en-US" w:eastAsia="ru-RU"/>
+          <w14:ligatures w14:val="none"/>
+        </w:rPr>
+        <w:t>$$</w:t>
+      </w:r>
+      <w:r>
+        <w:rPr>
+          <w:rFonts w:ascii="Courier New" w:eastAsia="Times New Roman" w:hAnsi="Courier New" w:cs="Courier New"/>
+          <w:color w:val="BCBEC4"/>
+          <w:kern w:val="0"/>
+          <w:sz w:val="20"/>
+          <w:szCs w:val="20"/>
+          <w:lang w:val="en-US" w:eastAsia="ru-RU"/>
+          <w14:ligatures w14:val="none"/>
+        </w:rPr>
+        <w:t>;</w:t>
+      </w:r>
+      <w:r>
+        <w:rPr>
+          <w:rFonts w:ascii="Courier New" w:eastAsia="Times New Roman" w:hAnsi="Courier New" w:cs="Courier New"/>
+          <w:color w:val="BCBEC4"/>
+          <w:kern w:val="0"/>
+          <w:sz w:val="20"/>
+          <w:szCs w:val="20"/>
+          <w:lang w:val="en-US" w:eastAsia="ru-RU"/>
+          <w14:ligatures w14:val="none"/>
+        </w:rPr>
+        <w:br/>
+      </w:r>
+      <w:r>
+        <w:rPr>
+          <w:rFonts w:ascii="Courier New" w:eastAsia="Times New Roman" w:hAnsi="Courier New" w:cs="Courier New"/>
+          <w:color w:val="BCBEC4"/>
+          <w:kern w:val="0"/>
+          <w:sz w:val="20"/>
+          <w:szCs w:val="20"/>
+          <w:lang w:val="en-US" w:eastAsia="ru-RU"/>
+          <w14:ligatures w14:val="none"/>
+        </w:rPr>
+        <w:br/>
+      </w:r>
+      <w:r>
+        <w:rPr>
+          <w:rFonts w:ascii="Courier New" w:eastAsia="Times New Roman" w:hAnsi="Courier New" w:cs="Courier New"/>
+          <w:color w:val="7A7E85"/>
+          <w:kern w:val="0"/>
+          <w:sz w:val="20"/>
+          <w:szCs w:val="20"/>
+          <w:lang w:val="en-US" w:eastAsia="ru-RU"/>
+          <w14:ligatures w14:val="none"/>
+        </w:rPr>
+        <w:t>-- 6. Drop duplicated typography columns from orders if they still exist</w:t>
+      </w:r>
+      <w:r>
+        <w:rPr>
+          <w:rFonts w:ascii="Courier New" w:eastAsia="Times New Roman" w:hAnsi="Courier New" w:cs="Courier New"/>
+          <w:color w:val="7A7E85"/>
+          <w:kern w:val="0"/>
+          <w:sz w:val="20"/>
+          <w:szCs w:val="20"/>
+          <w:lang w:val="en-US" w:eastAsia="ru-RU"/>
+          <w14:ligatures w14:val="none"/>
+        </w:rPr>
+        <w:br/>
+      </w:r>
+      <w:r>
+        <w:rPr>
+          <w:rFonts w:ascii="Courier New" w:eastAsia="Times New Roman" w:hAnsi="Courier New" w:cs="Courier New"/>
+          <w:color w:val="CF8E6D"/>
+          <w:kern w:val="0"/>
+          <w:sz w:val="20"/>
+          <w:szCs w:val="20"/>
+          <w:lang w:val="en-US" w:eastAsia="ru-RU"/>
+          <w14:ligatures w14:val="none"/>
+        </w:rPr>
+        <w:t xml:space="preserve">ALTER TABLE </w:t>
+      </w:r>
+      <w:r>
+        <w:rPr>
+          <w:rFonts w:ascii="Courier New" w:eastAsia="Times New Roman" w:hAnsi="Courier New" w:cs="Courier New"/>
+          <w:color w:val="BCBEC4"/>
+          <w:kern w:val="0"/>
+          <w:sz w:val="20"/>
+          <w:szCs w:val="20"/>
+          <w:lang w:val="en-US" w:eastAsia="ru-RU"/>
+          <w14:ligatures w14:val="none"/>
+        </w:rPr>
+        <w:t>orders</w:t>
+      </w:r>
+      <w:r>
+        <w:rPr>
+          <w:rFonts w:ascii="Courier New" w:eastAsia="Times New Roman" w:hAnsi="Courier New" w:cs="Courier New"/>
+          <w:color w:val="BCBEC4"/>
+          <w:kern w:val="0"/>
+          <w:sz w:val="20"/>
+          <w:szCs w:val="20"/>
+          <w:lang w:val="en-US" w:eastAsia="ru-RU"/>
+          <w14:ligatures w14:val="none"/>
+        </w:rPr>
+        <w:br/>
+        <w:t xml:space="preserve">  </w:t>
+      </w:r>
+      <w:r>
+        <w:rPr>
+          <w:rFonts w:ascii="Courier New" w:eastAsia="Times New Roman" w:hAnsi="Courier New" w:cs="Courier New"/>
+          <w:color w:val="CF8E6D"/>
+          <w:kern w:val="0"/>
+          <w:sz w:val="20"/>
+          <w:szCs w:val="20"/>
+          <w:lang w:val="en-US" w:eastAsia="ru-RU"/>
+          <w14:ligatures w14:val="none"/>
+        </w:rPr>
+        <w:t xml:space="preserve">DROP COLUMN IF EXISTS </w:t>
+      </w:r>
+      <w:r>
+        <w:rPr>
+          <w:rFonts w:ascii="Courier New" w:eastAsia="Times New Roman" w:hAnsi="Courier New" w:cs="Courier New"/>
+          <w:color w:val="C77DBB"/>
+          <w:kern w:val="0"/>
+          <w:sz w:val="20"/>
+          <w:szCs w:val="20"/>
+          <w:lang w:val="en-US" w:eastAsia="ru-RU"/>
+          <w14:ligatures w14:val="none"/>
+        </w:rPr>
+        <w:t>typography_name</w:t>
+      </w:r>
+      <w:r>
+        <w:rPr>
+          <w:rFonts w:ascii="Courier New" w:eastAsia="Times New Roman" w:hAnsi="Courier New" w:cs="Courier New"/>
+          <w:color w:val="BCBEC4"/>
+          <w:kern w:val="0"/>
+          <w:sz w:val="20"/>
+          <w:szCs w:val="20"/>
+          <w:lang w:val="en-US" w:eastAsia="ru-RU"/>
+          <w14:ligatures w14:val="none"/>
+        </w:rPr>
+        <w:t>,</w:t>
+      </w:r>
+      <w:r>
+        <w:rPr>
+          <w:rFonts w:ascii="Courier New" w:eastAsia="Times New Roman" w:hAnsi="Courier New" w:cs="Courier New"/>
+          <w:color w:val="BCBEC4"/>
+          <w:kern w:val="0"/>
+          <w:sz w:val="20"/>
+          <w:szCs w:val="20"/>
+          <w:lang w:val="en-US" w:eastAsia="ru-RU"/>
+          <w14:ligatures w14:val="none"/>
+        </w:rPr>
+        <w:br/>
+        <w:t xml:space="preserve">  </w:t>
+      </w:r>
+      <w:r>
+        <w:rPr>
+          <w:rFonts w:ascii="Courier New" w:eastAsia="Times New Roman" w:hAnsi="Courier New" w:cs="Courier New"/>
+          <w:color w:val="CF8E6D"/>
+          <w:kern w:val="0"/>
+          <w:sz w:val="20"/>
+          <w:szCs w:val="20"/>
+          <w:lang w:val="en-US" w:eastAsia="ru-RU"/>
+          <w14:ligatures w14:val="none"/>
+        </w:rPr>
+        <w:t xml:space="preserve">DROP COLUMN IF EXISTS </w:t>
+      </w:r>
+      <w:r>
+        <w:rPr>
+          <w:rFonts w:ascii="Courier New" w:eastAsia="Times New Roman" w:hAnsi="Courier New" w:cs="Courier New"/>
+          <w:color w:val="C77DBB"/>
+          <w:kern w:val="0"/>
+          <w:sz w:val="20"/>
+          <w:szCs w:val="20"/>
+          <w:lang w:val="en-US" w:eastAsia="ru-RU"/>
+          <w14:ligatures w14:val="none"/>
+        </w:rPr>
+        <w:t>typography_addr</w:t>
+      </w:r>
+      <w:r>
+        <w:rPr>
+          <w:rFonts w:ascii="Courier New" w:eastAsia="Times New Roman" w:hAnsi="Courier New" w:cs="Courier New"/>
+          <w:color w:val="BCBEC4"/>
+          <w:kern w:val="0"/>
+          <w:sz w:val="20"/>
+          <w:szCs w:val="20"/>
+          <w:lang w:val="en-US" w:eastAsia="ru-RU"/>
+          <w14:ligatures w14:val="none"/>
+        </w:rPr>
+        <w:t>,</w:t>
+      </w:r>
+      <w:r>
+        <w:rPr>
+          <w:rFonts w:ascii="Courier New" w:eastAsia="Times New Roman" w:hAnsi="Courier New" w:cs="Courier New"/>
+          <w:color w:val="BCBEC4"/>
+          <w:kern w:val="0"/>
+          <w:sz w:val="20"/>
+          <w:szCs w:val="20"/>
+          <w:lang w:val="en-US" w:eastAsia="ru-RU"/>
+          <w14:ligatures w14:val="none"/>
+        </w:rPr>
+        <w:br/>
+        <w:t xml:space="preserve">  </w:t>
+      </w:r>
+      <w:r>
+        <w:rPr>
+          <w:rFonts w:ascii="Courier New" w:eastAsia="Times New Roman" w:hAnsi="Courier New" w:cs="Courier New"/>
+          <w:color w:val="CF8E6D"/>
+          <w:kern w:val="0"/>
+          <w:sz w:val="20"/>
+          <w:szCs w:val="20"/>
+          <w:lang w:val="en-US" w:eastAsia="ru-RU"/>
+          <w14:ligatures w14:val="none"/>
+        </w:rPr>
+        <w:t xml:space="preserve">DROP COLUMN IF EXISTS </w:t>
+      </w:r>
+      <w:r>
+        <w:rPr>
+          <w:rFonts w:ascii="Courier New" w:eastAsia="Times New Roman" w:hAnsi="Courier New" w:cs="Courier New"/>
+          <w:color w:val="C77DBB"/>
+          <w:kern w:val="0"/>
+          <w:sz w:val="20"/>
+          <w:szCs w:val="20"/>
+          <w:lang w:val="en-US" w:eastAsia="ru-RU"/>
+          <w14:ligatures w14:val="none"/>
+        </w:rPr>
+        <w:t>typography_tel</w:t>
+      </w:r>
+      <w:r>
+        <w:rPr>
+          <w:rFonts w:ascii="Courier New" w:eastAsia="Times New Roman" w:hAnsi="Courier New" w:cs="Courier New"/>
+          <w:color w:val="BCBEC4"/>
+          <w:kern w:val="0"/>
+          <w:sz w:val="20"/>
+          <w:szCs w:val="20"/>
+          <w:lang w:val="en-US" w:eastAsia="ru-RU"/>
+          <w14:ligatures w14:val="none"/>
+        </w:rPr>
+        <w:t>;</w:t>
+      </w:r>
+      <w:r>
+        <w:rPr>
+          <w:rFonts w:ascii="Courier New" w:eastAsia="Times New Roman" w:hAnsi="Courier New" w:cs="Courier New"/>
+          <w:color w:val="BCBEC4"/>
+          <w:kern w:val="0"/>
+          <w:sz w:val="20"/>
+          <w:szCs w:val="20"/>
+          <w:lang w:val="en-US" w:eastAsia="ru-RU"/>
+          <w14:ligatures w14:val="none"/>
+        </w:rPr>
+        <w:br/>
+      </w:r>
+      <w:r>
+        <w:rPr>
+          <w:rFonts w:ascii="Courier New" w:eastAsia="Times New Roman" w:hAnsi="Courier New" w:cs="Courier New"/>
+          <w:color w:val="BCBEC4"/>
+          <w:kern w:val="0"/>
+          <w:sz w:val="20"/>
+          <w:szCs w:val="20"/>
+          <w:lang w:val="en-US" w:eastAsia="ru-RU"/>
+          <w14:ligatures w14:val="none"/>
+        </w:rPr>
+        <w:br/>
+      </w:r>
+      <w:r>
+        <w:rPr>
+          <w:rFonts w:ascii="Courier New" w:eastAsia="Times New Roman" w:hAnsi="Courier New" w:cs="Courier New"/>
+          <w:color w:val="CF8E6D"/>
+          <w:kern w:val="0"/>
+          <w:sz w:val="20"/>
+          <w:szCs w:val="20"/>
+          <w:lang w:val="en-US" w:eastAsia="ru-RU"/>
+          <w14:ligatures w14:val="none"/>
+        </w:rPr>
+        <w:t>COMMIT</w:t>
+      </w:r>
+      <w:r>
+        <w:rPr>
+          <w:rFonts w:ascii="Courier New" w:eastAsia="Times New Roman" w:hAnsi="Courier New" w:cs="Courier New"/>
+          <w:color w:val="BCBEC4"/>
+          <w:kern w:val="0"/>
+          <w:sz w:val="20"/>
+          <w:szCs w:val="20"/>
+          <w:lang w:val="en-US" w:eastAsia="ru-RU"/>
+          <w14:ligatures w14:val="none"/>
+        </w:rPr>
+        <w:t>;</w:t>
+      </w:r>
+    </w:p>
+    <w:p>
+      <w:pPr>
+        <w:rPr>
+          <w:lang w:val="en-US"/>
+        </w:rPr>
+      </w:pPr>
     </w:p>
     <w:sectPr>
       <w:pgSz w:w="11906" w:h="16838"/>
@@ -685,7 +3000,6 @@
   <w:style w:type="character" w:default="1" w:styleId="a0">
     <w:name w:val="Default Paragraph Font"/>
     <w:uiPriority w:val="1"/>
-    <w:semiHidden/>
     <w:unhideWhenUsed/>
   </w:style>
   <w:style w:type="table" w:default="1" w:styleId="a1">

</xml_diff>